<commit_message>
feat(terraform): provision Amazon EKS production cluster
</commit_message>
<xml_diff>
--- a/docs/retail-store-v2-validation-screenshots.docx
+++ b/docs/retail-store-v2-validation-screenshots.docx
@@ -161,6 +161,9 @@
     </w:p>
     <w:p>
       <w:r>
+        <w:rPr>
+          <w:noProof/>
+        </w:rPr>
         <w:drawing>
           <wp:inline distT="0" distB="0" distL="0" distR="0" wp14:anchorId="03403DEF" wp14:editId="73D7B0CD">
             <wp:extent cx="5943600" cy="3013075"/>
@@ -200,6 +203,9 @@
     </w:p>
     <w:p>
       <w:r>
+        <w:rPr>
+          <w:noProof/>
+        </w:rPr>
         <w:lastRenderedPageBreak/>
         <w:drawing>
           <wp:inline distT="0" distB="0" distL="0" distR="0" wp14:anchorId="70929AE7" wp14:editId="11A3BBAC">
@@ -240,6 +246,9 @@
     </w:p>
     <w:p>
       <w:r>
+        <w:rPr>
+          <w:noProof/>
+        </w:rPr>
         <w:drawing>
           <wp:inline distT="0" distB="0" distL="0" distR="0" wp14:anchorId="16853995" wp14:editId="757F31D0">
             <wp:extent cx="5943600" cy="3313430"/>
@@ -279,6 +288,9 @@
     </w:p>
     <w:p>
       <w:r>
+        <w:rPr>
+          <w:noProof/>
+        </w:rPr>
         <w:lastRenderedPageBreak/>
         <w:drawing>
           <wp:inline distT="0" distB="0" distL="0" distR="0" wp14:anchorId="289E37B8" wp14:editId="60134863">
@@ -305,6 +317,642 @@
                     <a:xfrm>
                       <a:off x="0" y="0"/>
                       <a:ext cx="5943600" cy="3484880"/>
+                    </a:xfrm>
+                    <a:prstGeom prst="rect">
+                      <a:avLst/>
+                    </a:prstGeom>
+                  </pic:spPr>
+                </pic:pic>
+              </a:graphicData>
+            </a:graphic>
+          </wp:inline>
+        </w:drawing>
+      </w:r>
+    </w:p>
+    <w:p>
+      <w:proofErr w:type="gramStart"/>
+      <w:r>
+        <w:t>Remote-state</w:t>
+      </w:r>
+      <w:proofErr w:type="gramEnd"/>
+      <w:r>
+        <w:t xml:space="preserve"> s3</w:t>
+      </w:r>
+      <w:r>
+        <w:t>: Use remote backend state file for team collaboration to maintain the state of your cloud infrastructure</w:t>
+      </w:r>
+      <w:r>
+        <w:t xml:space="preserve"> and record the</w:t>
+      </w:r>
+      <w:r>
+        <w:t xml:space="preserve"> cloud</w:t>
+      </w:r>
+      <w:r>
+        <w:t xml:space="preserve"> resources that were created.</w:t>
+      </w:r>
+    </w:p>
+    <w:p>
+      <w:r>
+        <w:t xml:space="preserve">State </w:t>
+      </w:r>
+      <w:proofErr w:type="gramStart"/>
+      <w:r>
+        <w:t>file is</w:t>
+      </w:r>
+      <w:proofErr w:type="gramEnd"/>
+      <w:r>
+        <w:t xml:space="preserve"> also used by EKS </w:t>
+      </w:r>
+      <w:proofErr w:type="gramStart"/>
+      <w:r>
+        <w:t>cluster</w:t>
+      </w:r>
+      <w:proofErr w:type="gramEnd"/>
+      <w:r>
+        <w:t xml:space="preserve"> to get the VPC ID of where to create private worker nodes in.</w:t>
+      </w:r>
+    </w:p>
+    <w:p>
+      <w:r>
+        <w:rPr>
+          <w:noProof/>
+        </w:rPr>
+        <w:drawing>
+          <wp:inline distT="0" distB="0" distL="0" distR="0" wp14:anchorId="513C75B8" wp14:editId="7AB14D6A">
+            <wp:extent cx="5943600" cy="3268345"/>
+            <wp:effectExtent l="0" t="0" r="0" b="8255"/>
+            <wp:docPr id="422713890" name="Picture 1"/>
+            <wp:cNvGraphicFramePr>
+              <a:graphicFrameLocks xmlns:a="http://schemas.openxmlformats.org/drawingml/2006/main" noChangeAspect="1"/>
+            </wp:cNvGraphicFramePr>
+            <a:graphic xmlns:a="http://schemas.openxmlformats.org/drawingml/2006/main">
+              <a:graphicData uri="http://schemas.openxmlformats.org/drawingml/2006/picture">
+                <pic:pic xmlns:pic="http://schemas.openxmlformats.org/drawingml/2006/picture">
+                  <pic:nvPicPr>
+                    <pic:cNvPr id="422713890" name=""/>
+                    <pic:cNvPicPr/>
+                  </pic:nvPicPr>
+                  <pic:blipFill>
+                    <a:blip r:embed="rId8"/>
+                    <a:stretch>
+                      <a:fillRect/>
+                    </a:stretch>
+                  </pic:blipFill>
+                  <pic:spPr>
+                    <a:xfrm>
+                      <a:off x="0" y="0"/>
+                      <a:ext cx="5943600" cy="3268345"/>
+                    </a:xfrm>
+                    <a:prstGeom prst="rect">
+                      <a:avLst/>
+                    </a:prstGeom>
+                  </pic:spPr>
+                </pic:pic>
+              </a:graphicData>
+            </a:graphic>
+          </wp:inline>
+        </w:drawing>
+      </w:r>
+    </w:p>
+    <w:p>
+      <w:r>
+        <w:rPr>
+          <w:noProof/>
+        </w:rPr>
+        <w:lastRenderedPageBreak/>
+        <w:drawing>
+          <wp:inline distT="0" distB="0" distL="0" distR="0" wp14:anchorId="2DDE2DCB" wp14:editId="621DE71F">
+            <wp:extent cx="5943600" cy="3672840"/>
+            <wp:effectExtent l="0" t="0" r="0" b="3810"/>
+            <wp:docPr id="859364418" name="Picture 1"/>
+            <wp:cNvGraphicFramePr>
+              <a:graphicFrameLocks xmlns:a="http://schemas.openxmlformats.org/drawingml/2006/main" noChangeAspect="1"/>
+            </wp:cNvGraphicFramePr>
+            <a:graphic xmlns:a="http://schemas.openxmlformats.org/drawingml/2006/main">
+              <a:graphicData uri="http://schemas.openxmlformats.org/drawingml/2006/picture">
+                <pic:pic xmlns:pic="http://schemas.openxmlformats.org/drawingml/2006/picture">
+                  <pic:nvPicPr>
+                    <pic:cNvPr id="859364418" name=""/>
+                    <pic:cNvPicPr/>
+                  </pic:nvPicPr>
+                  <pic:blipFill>
+                    <a:blip r:embed="rId9"/>
+                    <a:stretch>
+                      <a:fillRect/>
+                    </a:stretch>
+                  </pic:blipFill>
+                  <pic:spPr>
+                    <a:xfrm>
+                      <a:off x="0" y="0"/>
+                      <a:ext cx="5943600" cy="3672840"/>
+                    </a:xfrm>
+                    <a:prstGeom prst="rect">
+                      <a:avLst/>
+                    </a:prstGeom>
+                  </pic:spPr>
+                </pic:pic>
+              </a:graphicData>
+            </a:graphic>
+          </wp:inline>
+        </w:drawing>
+      </w:r>
+    </w:p>
+    <w:p>
+      <w:r>
+        <w:rPr>
+          <w:noProof/>
+        </w:rPr>
+        <w:drawing>
+          <wp:inline distT="0" distB="0" distL="0" distR="0" wp14:anchorId="5213F261" wp14:editId="27A9D5DE">
+            <wp:extent cx="5943600" cy="1819910"/>
+            <wp:effectExtent l="0" t="0" r="0" b="8890"/>
+            <wp:docPr id="1242416779" name="Picture 1"/>
+            <wp:cNvGraphicFramePr>
+              <a:graphicFrameLocks xmlns:a="http://schemas.openxmlformats.org/drawingml/2006/main" noChangeAspect="1"/>
+            </wp:cNvGraphicFramePr>
+            <a:graphic xmlns:a="http://schemas.openxmlformats.org/drawingml/2006/main">
+              <a:graphicData uri="http://schemas.openxmlformats.org/drawingml/2006/picture">
+                <pic:pic xmlns:pic="http://schemas.openxmlformats.org/drawingml/2006/picture">
+                  <pic:nvPicPr>
+                    <pic:cNvPr id="1242416779" name=""/>
+                    <pic:cNvPicPr/>
+                  </pic:nvPicPr>
+                  <pic:blipFill>
+                    <a:blip r:embed="rId10"/>
+                    <a:stretch>
+                      <a:fillRect/>
+                    </a:stretch>
+                  </pic:blipFill>
+                  <pic:spPr>
+                    <a:xfrm>
+                      <a:off x="0" y="0"/>
+                      <a:ext cx="5943600" cy="1819910"/>
+                    </a:xfrm>
+                    <a:prstGeom prst="rect">
+                      <a:avLst/>
+                    </a:prstGeom>
+                  </pic:spPr>
+                </pic:pic>
+              </a:graphicData>
+            </a:graphic>
+          </wp:inline>
+        </w:drawing>
+      </w:r>
+    </w:p>
+    <w:p/>
+    <w:p/>
+    <w:p/>
+    <w:p/>
+    <w:p/>
+    <w:p/>
+    <w:p/>
+    <w:p/>
+    <w:p>
+      <w:r>
+        <w:lastRenderedPageBreak/>
+        <w:t>"</w:t>
+      </w:r>
+      <w:proofErr w:type="gramStart"/>
+      <w:r>
+        <w:t>feat</w:t>
+      </w:r>
+      <w:proofErr w:type="gramEnd"/>
+      <w:r>
+        <w:t>(terraform): provision production networking foundation"</w:t>
+      </w:r>
+      <w:r>
+        <w:br/>
+        <w:t>- Configure Terraform remote state backend with Amazon S3</w:t>
+      </w:r>
+      <w:r>
+        <w:br/>
+        <w:t>- Provision production VPC across three Availability Zones</w:t>
+      </w:r>
+      <w:r>
+        <w:br/>
+        <w:t>- Create public and private subnet topology</w:t>
+      </w:r>
+      <w:r>
+        <w:br/>
+        <w:t>- Deploy Internet Gateway and NAT Gateway</w:t>
+      </w:r>
+      <w:r>
+        <w:br/>
+        <w:t>- Configure public and private route tables</w:t>
+      </w:r>
+      <w:r>
+        <w:br/>
+        <w:t>- Export networking outputs for future EKS deployment</w:t>
+      </w:r>
+    </w:p>
+    <w:p>
+      <w:pPr>
+        <w:rPr>
+          <w:b/>
+          <w:bCs/>
+        </w:rPr>
+      </w:pPr>
+      <w:r>
+        <w:rPr>
+          <w:b/>
+          <w:bCs/>
+          <w:highlight w:val="yellow"/>
+        </w:rPr>
+        <w:t>Production-grade VPC:</w:t>
+      </w:r>
+    </w:p>
+    <w:p>
+      <w:r>
+        <w:t>AWS VPC with 3 Public and 3 Private subnets.</w:t>
+      </w:r>
+    </w:p>
+    <w:p>
+      <w:pPr>
+        <w:rPr>
+          <w:b/>
+          <w:bCs/>
+        </w:rPr>
+      </w:pPr>
+      <w:r>
+        <w:rPr>
+          <w:b/>
+          <w:bCs/>
+        </w:rPr>
+        <w:t>1. Three availability zones with public and private subnets in each zone.</w:t>
+      </w:r>
+    </w:p>
+    <w:p>
+      <w:r>
+        <w:rPr>
+          <w:b/>
+          <w:bCs/>
+        </w:rPr>
+        <w:tab/>
+        <w:t>a. Each Public subnet has a NAT Gateway which will allow traffic to go from the private subnet to the NAT Gateway, to the Internet Gateway and lastly to the internet.</w:t>
+      </w:r>
+    </w:p>
+    <w:p>
+      <w:r>
+        <w:rPr>
+          <w:noProof/>
+        </w:rPr>
+        <w:drawing>
+          <wp:inline distT="0" distB="0" distL="0" distR="0" wp14:anchorId="44753345" wp14:editId="5F3CAD6A">
+            <wp:extent cx="5115639" cy="4591691"/>
+            <wp:effectExtent l="0" t="0" r="8890" b="0"/>
+            <wp:docPr id="710402260" name="Picture 1"/>
+            <wp:cNvGraphicFramePr>
+              <a:graphicFrameLocks xmlns:a="http://schemas.openxmlformats.org/drawingml/2006/main" noChangeAspect="1"/>
+            </wp:cNvGraphicFramePr>
+            <a:graphic xmlns:a="http://schemas.openxmlformats.org/drawingml/2006/main">
+              <a:graphicData uri="http://schemas.openxmlformats.org/drawingml/2006/picture">
+                <pic:pic xmlns:pic="http://schemas.openxmlformats.org/drawingml/2006/picture">
+                  <pic:nvPicPr>
+                    <pic:cNvPr id="710402260" name=""/>
+                    <pic:cNvPicPr/>
+                  </pic:nvPicPr>
+                  <pic:blipFill>
+                    <a:blip r:embed="rId11"/>
+                    <a:stretch>
+                      <a:fillRect/>
+                    </a:stretch>
+                  </pic:blipFill>
+                  <pic:spPr>
+                    <a:xfrm>
+                      <a:off x="0" y="0"/>
+                      <a:ext cx="5115639" cy="4591691"/>
+                    </a:xfrm>
+                    <a:prstGeom prst="rect">
+                      <a:avLst/>
+                    </a:prstGeom>
+                  </pic:spPr>
+                </pic:pic>
+              </a:graphicData>
+            </a:graphic>
+          </wp:inline>
+        </w:drawing>
+      </w:r>
+    </w:p>
+    <w:p>
+      <w:r>
+        <w:rPr>
+          <w:noProof/>
+        </w:rPr>
+        <w:lastRenderedPageBreak/>
+        <w:drawing>
+          <wp:inline distT="0" distB="0" distL="0" distR="0" wp14:anchorId="5D5EAC27" wp14:editId="0119F99C">
+            <wp:extent cx="5943600" cy="2261235"/>
+            <wp:effectExtent l="0" t="0" r="0" b="5715"/>
+            <wp:docPr id="591096635" name="Picture 1"/>
+            <wp:cNvGraphicFramePr>
+              <a:graphicFrameLocks xmlns:a="http://schemas.openxmlformats.org/drawingml/2006/main" noChangeAspect="1"/>
+            </wp:cNvGraphicFramePr>
+            <a:graphic xmlns:a="http://schemas.openxmlformats.org/drawingml/2006/main">
+              <a:graphicData uri="http://schemas.openxmlformats.org/drawingml/2006/picture">
+                <pic:pic xmlns:pic="http://schemas.openxmlformats.org/drawingml/2006/picture">
+                  <pic:nvPicPr>
+                    <pic:cNvPr id="591096635" name=""/>
+                    <pic:cNvPicPr/>
+                  </pic:nvPicPr>
+                  <pic:blipFill>
+                    <a:blip r:embed="rId12"/>
+                    <a:stretch>
+                      <a:fillRect/>
+                    </a:stretch>
+                  </pic:blipFill>
+                  <pic:spPr>
+                    <a:xfrm>
+                      <a:off x="0" y="0"/>
+                      <a:ext cx="5943600" cy="2261235"/>
+                    </a:xfrm>
+                    <a:prstGeom prst="rect">
+                      <a:avLst/>
+                    </a:prstGeom>
+                  </pic:spPr>
+                </pic:pic>
+              </a:graphicData>
+            </a:graphic>
+          </wp:inline>
+        </w:drawing>
+      </w:r>
+    </w:p>
+    <w:p>
+      <w:r>
+        <w:rPr>
+          <w:highlight w:val="yellow"/>
+        </w:rPr>
+        <w:t>Nat gateway</w:t>
+      </w:r>
+    </w:p>
+    <w:p>
+      <w:r>
+        <w:rPr>
+          <w:noProof/>
+        </w:rPr>
+        <w:drawing>
+          <wp:inline distT="0" distB="0" distL="0" distR="0" wp14:anchorId="02763F84" wp14:editId="4CC77A24">
+            <wp:extent cx="5943600" cy="3088005"/>
+            <wp:effectExtent l="0" t="0" r="0" b="0"/>
+            <wp:docPr id="199975344" name="Picture 1"/>
+            <wp:cNvGraphicFramePr>
+              <a:graphicFrameLocks xmlns:a="http://schemas.openxmlformats.org/drawingml/2006/main" noChangeAspect="1"/>
+            </wp:cNvGraphicFramePr>
+            <a:graphic xmlns:a="http://schemas.openxmlformats.org/drawingml/2006/main">
+              <a:graphicData uri="http://schemas.openxmlformats.org/drawingml/2006/picture">
+                <pic:pic xmlns:pic="http://schemas.openxmlformats.org/drawingml/2006/picture">
+                  <pic:nvPicPr>
+                    <pic:cNvPr id="199975344" name=""/>
+                    <pic:cNvPicPr/>
+                  </pic:nvPicPr>
+                  <pic:blipFill>
+                    <a:blip r:embed="rId13"/>
+                    <a:stretch>
+                      <a:fillRect/>
+                    </a:stretch>
+                  </pic:blipFill>
+                  <pic:spPr>
+                    <a:xfrm>
+                      <a:off x="0" y="0"/>
+                      <a:ext cx="5943600" cy="3088005"/>
+                    </a:xfrm>
+                    <a:prstGeom prst="rect">
+                      <a:avLst/>
+                    </a:prstGeom>
+                  </pic:spPr>
+                </pic:pic>
+              </a:graphicData>
+            </a:graphic>
+          </wp:inline>
+        </w:drawing>
+      </w:r>
+    </w:p>
+    <w:p>
+      <w:pPr>
+        <w:rPr>
+          <w:noProof/>
+        </w:rPr>
+      </w:pPr>
+      <w:proofErr w:type="spellStart"/>
+      <w:r>
+        <w:rPr>
+          <w:highlight w:val="yellow"/>
+        </w:rPr>
+        <w:t>igw</w:t>
+      </w:r>
+      <w:proofErr w:type="spellEnd"/>
+      <w:r>
+        <w:rPr>
+          <w:noProof/>
+        </w:rPr>
+        <w:t xml:space="preserve"> </w:t>
+      </w:r>
+      <w:r>
+        <w:rPr>
+          <w:noProof/>
+        </w:rPr>
+        <w:drawing>
+          <wp:inline distT="0" distB="0" distL="0" distR="0" wp14:anchorId="0918D229" wp14:editId="31B29306">
+            <wp:extent cx="5943600" cy="1137285"/>
+            <wp:effectExtent l="0" t="0" r="0" b="5715"/>
+            <wp:docPr id="769056169" name="Picture 1"/>
+            <wp:cNvGraphicFramePr>
+              <a:graphicFrameLocks xmlns:a="http://schemas.openxmlformats.org/drawingml/2006/main" noChangeAspect="1"/>
+            </wp:cNvGraphicFramePr>
+            <a:graphic xmlns:a="http://schemas.openxmlformats.org/drawingml/2006/main">
+              <a:graphicData uri="http://schemas.openxmlformats.org/drawingml/2006/picture">
+                <pic:pic xmlns:pic="http://schemas.openxmlformats.org/drawingml/2006/picture">
+                  <pic:nvPicPr>
+                    <pic:cNvPr id="769056169" name=""/>
+                    <pic:cNvPicPr/>
+                  </pic:nvPicPr>
+                  <pic:blipFill>
+                    <a:blip r:embed="rId14"/>
+                    <a:stretch>
+                      <a:fillRect/>
+                    </a:stretch>
+                  </pic:blipFill>
+                  <pic:spPr>
+                    <a:xfrm>
+                      <a:off x="0" y="0"/>
+                      <a:ext cx="5943600" cy="1137285"/>
+                    </a:xfrm>
+                    <a:prstGeom prst="rect">
+                      <a:avLst/>
+                    </a:prstGeom>
+                  </pic:spPr>
+                </pic:pic>
+              </a:graphicData>
+            </a:graphic>
+          </wp:inline>
+        </w:drawing>
+      </w:r>
+    </w:p>
+    <w:p>
+      <w:pPr>
+        <w:rPr>
+          <w:noProof/>
+        </w:rPr>
+      </w:pPr>
+    </w:p>
+    <w:p>
+      <w:pPr>
+        <w:rPr>
+          <w:noProof/>
+        </w:rPr>
+      </w:pPr>
+    </w:p>
+    <w:p>
+      <w:r>
+        <w:rPr>
+          <w:noProof/>
+        </w:rPr>
+        <w:lastRenderedPageBreak/>
+        <w:t>provision Amazon EKS production cluster</w:t>
+      </w:r>
+      <w:r>
+        <w:drawing>
+          <wp:inline distT="0" distB="0" distL="0" distR="0" wp14:anchorId="3FD29C89" wp14:editId="2C0DD4DD">
+            <wp:extent cx="6497932" cy="3388505"/>
+            <wp:effectExtent l="0" t="0" r="0" b="2540"/>
+            <wp:docPr id="89257689" name="Picture 1"/>
+            <wp:cNvGraphicFramePr>
+              <a:graphicFrameLocks xmlns:a="http://schemas.openxmlformats.org/drawingml/2006/main" noChangeAspect="1"/>
+            </wp:cNvGraphicFramePr>
+            <a:graphic xmlns:a="http://schemas.openxmlformats.org/drawingml/2006/main">
+              <a:graphicData uri="http://schemas.openxmlformats.org/drawingml/2006/picture">
+                <pic:pic xmlns:pic="http://schemas.openxmlformats.org/drawingml/2006/picture">
+                  <pic:nvPicPr>
+                    <pic:cNvPr id="89257689" name=""/>
+                    <pic:cNvPicPr/>
+                  </pic:nvPicPr>
+                  <pic:blipFill>
+                    <a:blip r:embed="rId15"/>
+                    <a:stretch>
+                      <a:fillRect/>
+                    </a:stretch>
+                  </pic:blipFill>
+                  <pic:spPr>
+                    <a:xfrm>
+                      <a:off x="0" y="0"/>
+                      <a:ext cx="6511918" cy="3395799"/>
+                    </a:xfrm>
+                    <a:prstGeom prst="rect">
+                      <a:avLst/>
+                    </a:prstGeom>
+                  </pic:spPr>
+                </pic:pic>
+              </a:graphicData>
+            </a:graphic>
+          </wp:inline>
+        </w:drawing>
+      </w:r>
+    </w:p>
+    <w:p>
+      <w:r>
+        <w:drawing>
+          <wp:inline distT="0" distB="0" distL="0" distR="0" wp14:anchorId="4E81ED5E" wp14:editId="487D227B">
+            <wp:extent cx="5943600" cy="1406525"/>
+            <wp:effectExtent l="0" t="0" r="0" b="3175"/>
+            <wp:docPr id="154478658" name="Picture 1"/>
+            <wp:cNvGraphicFramePr>
+              <a:graphicFrameLocks xmlns:a="http://schemas.openxmlformats.org/drawingml/2006/main" noChangeAspect="1"/>
+            </wp:cNvGraphicFramePr>
+            <a:graphic xmlns:a="http://schemas.openxmlformats.org/drawingml/2006/main">
+              <a:graphicData uri="http://schemas.openxmlformats.org/drawingml/2006/picture">
+                <pic:pic xmlns:pic="http://schemas.openxmlformats.org/drawingml/2006/picture">
+                  <pic:nvPicPr>
+                    <pic:cNvPr id="154478658" name=""/>
+                    <pic:cNvPicPr/>
+                  </pic:nvPicPr>
+                  <pic:blipFill>
+                    <a:blip r:embed="rId16"/>
+                    <a:stretch>
+                      <a:fillRect/>
+                    </a:stretch>
+                  </pic:blipFill>
+                  <pic:spPr>
+                    <a:xfrm>
+                      <a:off x="0" y="0"/>
+                      <a:ext cx="5943600" cy="1406525"/>
+                    </a:xfrm>
+                    <a:prstGeom prst="rect">
+                      <a:avLst/>
+                    </a:prstGeom>
+                  </pic:spPr>
+                </pic:pic>
+              </a:graphicData>
+            </a:graphic>
+          </wp:inline>
+        </w:drawing>
+      </w:r>
+    </w:p>
+    <w:p>
+      <w:r>
+        <w:drawing>
+          <wp:inline distT="0" distB="0" distL="0" distR="0" wp14:anchorId="021B4F22" wp14:editId="3FB1C13D">
+            <wp:extent cx="5943600" cy="1724660"/>
+            <wp:effectExtent l="0" t="0" r="0" b="8890"/>
+            <wp:docPr id="2024077097" name="Picture 1"/>
+            <wp:cNvGraphicFramePr>
+              <a:graphicFrameLocks xmlns:a="http://schemas.openxmlformats.org/drawingml/2006/main" noChangeAspect="1"/>
+            </wp:cNvGraphicFramePr>
+            <a:graphic xmlns:a="http://schemas.openxmlformats.org/drawingml/2006/main">
+              <a:graphicData uri="http://schemas.openxmlformats.org/drawingml/2006/picture">
+                <pic:pic xmlns:pic="http://schemas.openxmlformats.org/drawingml/2006/picture">
+                  <pic:nvPicPr>
+                    <pic:cNvPr id="2024077097" name=""/>
+                    <pic:cNvPicPr/>
+                  </pic:nvPicPr>
+                  <pic:blipFill>
+                    <a:blip r:embed="rId17"/>
+                    <a:stretch>
+                      <a:fillRect/>
+                    </a:stretch>
+                  </pic:blipFill>
+                  <pic:spPr>
+                    <a:xfrm>
+                      <a:off x="0" y="0"/>
+                      <a:ext cx="5943600" cy="1724660"/>
+                    </a:xfrm>
+                    <a:prstGeom prst="rect">
+                      <a:avLst/>
+                    </a:prstGeom>
+                  </pic:spPr>
+                </pic:pic>
+              </a:graphicData>
+            </a:graphic>
+          </wp:inline>
+        </w:drawing>
+      </w:r>
+    </w:p>
+    <w:p>
+      <w:r>
+        <w:lastRenderedPageBreak/>
+        <w:drawing>
+          <wp:inline distT="0" distB="0" distL="0" distR="0" wp14:anchorId="1EF714B1" wp14:editId="2CA4F4C8">
+            <wp:extent cx="5943600" cy="2135505"/>
+            <wp:effectExtent l="0" t="0" r="0" b="0"/>
+            <wp:docPr id="219810962" name="Picture 1"/>
+            <wp:cNvGraphicFramePr>
+              <a:graphicFrameLocks xmlns:a="http://schemas.openxmlformats.org/drawingml/2006/main" noChangeAspect="1"/>
+            </wp:cNvGraphicFramePr>
+            <a:graphic xmlns:a="http://schemas.openxmlformats.org/drawingml/2006/main">
+              <a:graphicData uri="http://schemas.openxmlformats.org/drawingml/2006/picture">
+                <pic:pic xmlns:pic="http://schemas.openxmlformats.org/drawingml/2006/picture">
+                  <pic:nvPicPr>
+                    <pic:cNvPr id="219810962" name=""/>
+                    <pic:cNvPicPr/>
+                  </pic:nvPicPr>
+                  <pic:blipFill>
+                    <a:blip r:embed="rId18"/>
+                    <a:stretch>
+                      <a:fillRect/>
+                    </a:stretch>
+                  </pic:blipFill>
+                  <pic:spPr>
+                    <a:xfrm>
+                      <a:off x="0" y="0"/>
+                      <a:ext cx="5943600" cy="2135505"/>
                     </a:xfrm>
                     <a:prstGeom prst="rect">
                       <a:avLst/>
@@ -930,7 +1578,6 @@
   <w:style w:type="character" w:default="1" w:styleId="DefaultParagraphFont">
     <w:name w:val="Default Paragraph Font"/>
     <w:uiPriority w:val="1"/>
-    <w:semiHidden/>
     <w:unhideWhenUsed/>
   </w:style>
   <w:style w:type="table" w:default="1" w:styleId="TableNormal">

</xml_diff>

<commit_message>
feat(platform): automate EKS platform bootstrap with Terraform
</commit_message>
<xml_diff>
--- a/docs/retail-store-v2-validation-screenshots.docx
+++ b/docs/retail-store-v2-validation-screenshots.docx
@@ -12,8 +12,16 @@
         <w:rPr>
           <w:color w:val="EE0000"/>
         </w:rPr>
-        <w:t>feat: add Retail Store v2 application source and production Dockerfiles</w:t>
-      </w:r>
+        <w:t xml:space="preserve">feat: add Retail Store v2 application source and production </w:t>
+      </w:r>
+      <w:proofErr w:type="spellStart"/>
+      <w:r>
+        <w:rPr>
+          <w:color w:val="EE0000"/>
+        </w:rPr>
+        <w:t>Dockerfiles</w:t>
+      </w:r>
+      <w:proofErr w:type="spellEnd"/>
     </w:p>
     <w:p>
       <w:pPr>
@@ -38,8 +46,16 @@
         <w:rPr>
           <w:color w:val="EE0000"/>
         </w:rPr>
-        <w:t>- Implement production-grade multi-stage Dockerfiles</w:t>
-      </w:r>
+        <w:t xml:space="preserve">- Implement production-grade multi-stage </w:t>
+      </w:r>
+      <w:proofErr w:type="spellStart"/>
+      <w:r>
+        <w:rPr>
+          <w:color w:val="EE0000"/>
+        </w:rPr>
+        <w:t>Dockerfiles</w:t>
+      </w:r>
+      <w:proofErr w:type="spellEnd"/>
     </w:p>
     <w:p>
       <w:pPr>
@@ -114,7 +130,25 @@
           <w:bCs/>
           <w:highlight w:val="yellow"/>
         </w:rPr>
-        <w:t>Docker compose implementation</w:t>
+        <w:t xml:space="preserve">Docker </w:t>
+      </w:r>
+      <w:proofErr w:type="gramStart"/>
+      <w:r>
+        <w:rPr>
+          <w:b/>
+          <w:bCs/>
+          <w:highlight w:val="yellow"/>
+        </w:rPr>
+        <w:t>compose</w:t>
+      </w:r>
+      <w:proofErr w:type="gramEnd"/>
+      <w:r>
+        <w:rPr>
+          <w:b/>
+          <w:bCs/>
+          <w:highlight w:val="yellow"/>
+        </w:rPr>
+        <w:t xml:space="preserve"> implementation</w:t>
       </w:r>
       <w:r>
         <w:rPr>
@@ -296,8 +330,13 @@
       </w:r>
     </w:p>
     <w:p>
-      <w:r>
-        <w:t>Remote-state s3</w:t>
+      <w:proofErr w:type="gramStart"/>
+      <w:r>
+        <w:t>Remote-state</w:t>
+      </w:r>
+      <w:proofErr w:type="gramEnd"/>
+      <w:r>
+        <w:t xml:space="preserve"> s3</w:t>
       </w:r>
       <w:r>
         <w:t>: Use remote backend state file for team collaboration to maintain the state of your cloud infrastructure</w:t>
@@ -314,7 +353,23 @@
     </w:p>
     <w:p>
       <w:r>
-        <w:t>State file is also used by EKS cluster to get the VPC ID of where to create private worker nodes in.</w:t>
+        <w:t xml:space="preserve">State </w:t>
+      </w:r>
+      <w:proofErr w:type="gramStart"/>
+      <w:r>
+        <w:t>file is</w:t>
+      </w:r>
+      <w:proofErr w:type="gramEnd"/>
+      <w:r>
+        <w:t xml:space="preserve"> also used by EKS </w:t>
+      </w:r>
+      <w:proofErr w:type="gramStart"/>
+      <w:r>
+        <w:t>cluster</w:t>
+      </w:r>
+      <w:proofErr w:type="gramEnd"/>
+      <w:r>
+        <w:t xml:space="preserve"> to get the VPC ID of where to create private worker nodes in.</w:t>
       </w:r>
     </w:p>
     <w:p>
@@ -455,7 +510,15 @@
     <w:p>
       <w:r>
         <w:lastRenderedPageBreak/>
-        <w:t>"feat(terraform): provision production networking foundation"</w:t>
+        <w:t>"</w:t>
+      </w:r>
+      <w:proofErr w:type="gramStart"/>
+      <w:r>
+        <w:t>feat</w:t>
+      </w:r>
+      <w:proofErr w:type="gramEnd"/>
+      <w:r>
+        <w:t>(terraform): provision production networking foundation"</w:t>
       </w:r>
       <w:r>
         <w:br/>
@@ -669,12 +732,14 @@
           <w:noProof/>
         </w:rPr>
       </w:pPr>
+      <w:proofErr w:type="spellStart"/>
       <w:r>
         <w:rPr>
           <w:highlight w:val="yellow"/>
         </w:rPr>
         <w:t>igw</w:t>
       </w:r>
+      <w:proofErr w:type="spellEnd"/>
       <w:r>
         <w:rPr>
           <w:noProof/>
@@ -1019,7 +1084,15 @@
         <w:t xml:space="preserve">od Identity Agent </w:t>
       </w:r>
       <w:r>
-        <w:t>installed and running as a daemonset on each node in the cluster</w:t>
+        <w:t xml:space="preserve">installed and running as a </w:t>
+      </w:r>
+      <w:proofErr w:type="spellStart"/>
+      <w:r>
+        <w:t>daemonset</w:t>
+      </w:r>
+      <w:proofErr w:type="spellEnd"/>
+      <w:r>
+        <w:t xml:space="preserve"> on each node in the cluster</w:t>
       </w:r>
       <w:r>
         <w:t xml:space="preserve"> for secured workload identity to AWS resources.</w:t>
@@ -1074,8 +1147,21 @@
       <w:r>
         <w:t xml:space="preserve">for </w:t>
       </w:r>
-      <w:r>
-        <w:t>ebs-csi-driver</w:t>
+      <w:proofErr w:type="spellStart"/>
+      <w:r>
+        <w:t>ebs</w:t>
+      </w:r>
+      <w:proofErr w:type="spellEnd"/>
+      <w:r>
+        <w:t>-</w:t>
+      </w:r>
+      <w:proofErr w:type="spellStart"/>
+      <w:r>
+        <w:t>csi</w:t>
+      </w:r>
+      <w:proofErr w:type="spellEnd"/>
+      <w:r>
+        <w:t>-driver</w:t>
       </w:r>
     </w:p>
     <w:p>
@@ -1317,6 +1403,9 @@
     </w:p>
     <w:p>
       <w:r>
+        <w:rPr>
+          <w:noProof/>
+        </w:rPr>
         <w:drawing>
           <wp:inline distT="0" distB="0" distL="0" distR="0" wp14:anchorId="58575F51" wp14:editId="58B29293">
             <wp:extent cx="5943600" cy="1485900"/>
@@ -1354,6 +1443,248 @@
         </w:drawing>
       </w:r>
     </w:p>
+    <w:p>
+      <w:pPr>
+        <w:rPr>
+          <w:noProof/>
+        </w:rPr>
+      </w:pPr>
+      <w:r>
+        <w:lastRenderedPageBreak/>
+        <w:drawing>
+          <wp:inline distT="0" distB="0" distL="0" distR="0" wp14:anchorId="0CE191C7" wp14:editId="4CB2E81D">
+            <wp:extent cx="5943600" cy="4638040"/>
+            <wp:effectExtent l="0" t="0" r="0" b="0"/>
+            <wp:docPr id="1077018310" name="Picture 1"/>
+            <wp:cNvGraphicFramePr>
+              <a:graphicFrameLocks xmlns:a="http://schemas.openxmlformats.org/drawingml/2006/main" noChangeAspect="1"/>
+            </wp:cNvGraphicFramePr>
+            <a:graphic xmlns:a="http://schemas.openxmlformats.org/drawingml/2006/main">
+              <a:graphicData uri="http://schemas.openxmlformats.org/drawingml/2006/picture">
+                <pic:pic xmlns:pic="http://schemas.openxmlformats.org/drawingml/2006/picture">
+                  <pic:nvPicPr>
+                    <pic:cNvPr id="1077018310" name=""/>
+                    <pic:cNvPicPr/>
+                  </pic:nvPicPr>
+                  <pic:blipFill>
+                    <a:blip r:embed="rId28"/>
+                    <a:stretch>
+                      <a:fillRect/>
+                    </a:stretch>
+                  </pic:blipFill>
+                  <pic:spPr>
+                    <a:xfrm>
+                      <a:off x="0" y="0"/>
+                      <a:ext cx="5943600" cy="4638040"/>
+                    </a:xfrm>
+                    <a:prstGeom prst="rect">
+                      <a:avLst/>
+                    </a:prstGeom>
+                  </pic:spPr>
+                </pic:pic>
+              </a:graphicData>
+            </a:graphic>
+          </wp:inline>
+        </w:drawing>
+      </w:r>
+      <w:r>
+        <w:rPr>
+          <w:noProof/>
+        </w:rPr>
+        <w:t xml:space="preserve"> </w:t>
+      </w:r>
+      <w:r>
+        <w:lastRenderedPageBreak/>
+        <w:drawing>
+          <wp:inline distT="0" distB="0" distL="0" distR="0" wp14:anchorId="1EC25F45" wp14:editId="6FE651D0">
+            <wp:extent cx="5943600" cy="3752215"/>
+            <wp:effectExtent l="0" t="0" r="0" b="635"/>
+            <wp:docPr id="197480193" name="Picture 1"/>
+            <wp:cNvGraphicFramePr>
+              <a:graphicFrameLocks xmlns:a="http://schemas.openxmlformats.org/drawingml/2006/main" noChangeAspect="1"/>
+            </wp:cNvGraphicFramePr>
+            <a:graphic xmlns:a="http://schemas.openxmlformats.org/drawingml/2006/main">
+              <a:graphicData uri="http://schemas.openxmlformats.org/drawingml/2006/picture">
+                <pic:pic xmlns:pic="http://schemas.openxmlformats.org/drawingml/2006/picture">
+                  <pic:nvPicPr>
+                    <pic:cNvPr id="197480193" name=""/>
+                    <pic:cNvPicPr/>
+                  </pic:nvPicPr>
+                  <pic:blipFill>
+                    <a:blip r:embed="rId29"/>
+                    <a:stretch>
+                      <a:fillRect/>
+                    </a:stretch>
+                  </pic:blipFill>
+                  <pic:spPr>
+                    <a:xfrm>
+                      <a:off x="0" y="0"/>
+                      <a:ext cx="5943600" cy="3752215"/>
+                    </a:xfrm>
+                    <a:prstGeom prst="rect">
+                      <a:avLst/>
+                    </a:prstGeom>
+                  </pic:spPr>
+                </pic:pic>
+              </a:graphicData>
+            </a:graphic>
+          </wp:inline>
+        </w:drawing>
+      </w:r>
+    </w:p>
+    <w:p>
+      <w:pPr>
+        <w:rPr>
+          <w:noProof/>
+        </w:rPr>
+      </w:pPr>
+    </w:p>
+    <w:p>
+      <w:pPr>
+        <w:rPr>
+          <w:noProof/>
+        </w:rPr>
+      </w:pPr>
+    </w:p>
+    <w:p>
+      <w:pPr>
+        <w:rPr>
+          <w:noProof/>
+        </w:rPr>
+      </w:pPr>
+    </w:p>
+    <w:p>
+      <w:pPr>
+        <w:rPr>
+          <w:noProof/>
+        </w:rPr>
+      </w:pPr>
+    </w:p>
+    <w:p>
+      <w:pPr>
+        <w:rPr>
+          <w:noProof/>
+        </w:rPr>
+      </w:pPr>
+    </w:p>
+    <w:p>
+      <w:pPr>
+        <w:rPr>
+          <w:noProof/>
+        </w:rPr>
+      </w:pPr>
+    </w:p>
+    <w:p>
+      <w:pPr>
+        <w:rPr>
+          <w:noProof/>
+        </w:rPr>
+      </w:pPr>
+    </w:p>
+    <w:p>
+      <w:pPr>
+        <w:rPr>
+          <w:noProof/>
+        </w:rPr>
+      </w:pPr>
+    </w:p>
+    <w:p>
+      <w:pPr>
+        <w:rPr>
+          <w:noProof/>
+        </w:rPr>
+      </w:pPr>
+    </w:p>
+    <w:p>
+      <w:pPr>
+        <w:rPr>
+          <w:noProof/>
+        </w:rPr>
+      </w:pPr>
+    </w:p>
+    <w:p>
+      <w:pPr>
+        <w:rPr>
+          <w:noProof/>
+        </w:rPr>
+      </w:pPr>
+    </w:p>
+    <w:p>
+      <w:pPr>
+        <w:rPr>
+          <w:noProof/>
+        </w:rPr>
+      </w:pPr>
+    </w:p>
+    <w:p>
+      <w:pPr>
+        <w:rPr>
+          <w:noProof/>
+        </w:rPr>
+      </w:pPr>
+    </w:p>
+    <w:p>
+      <w:pPr>
+        <w:rPr>
+          <w:noProof/>
+        </w:rPr>
+      </w:pPr>
+    </w:p>
+    <w:p>
+      <w:pPr>
+        <w:rPr>
+          <w:noProof/>
+        </w:rPr>
+      </w:pPr>
+      <w:r>
+        <w:rPr>
+          <w:noProof/>
+        </w:rPr>
+        <w:lastRenderedPageBreak/>
+        <w:t>"feat(platform): automate EKS platform bootstrap with Terraform"</w:t>
+      </w:r>
+    </w:p>
+    <w:p>
+      <w:r>
+        <w:drawing>
+          <wp:inline distT="0" distB="0" distL="0" distR="0" wp14:anchorId="3A836E9A" wp14:editId="7C42B262">
+            <wp:extent cx="5943600" cy="4371340"/>
+            <wp:effectExtent l="0" t="0" r="0" b="0"/>
+            <wp:docPr id="711808844" name="Picture 1"/>
+            <wp:cNvGraphicFramePr>
+              <a:graphicFrameLocks xmlns:a="http://schemas.openxmlformats.org/drawingml/2006/main" noChangeAspect="1"/>
+            </wp:cNvGraphicFramePr>
+            <a:graphic xmlns:a="http://schemas.openxmlformats.org/drawingml/2006/main">
+              <a:graphicData uri="http://schemas.openxmlformats.org/drawingml/2006/picture">
+                <pic:pic xmlns:pic="http://schemas.openxmlformats.org/drawingml/2006/picture">
+                  <pic:nvPicPr>
+                    <pic:cNvPr id="711808844" name=""/>
+                    <pic:cNvPicPr/>
+                  </pic:nvPicPr>
+                  <pic:blipFill>
+                    <a:blip r:embed="rId30"/>
+                    <a:stretch>
+                      <a:fillRect/>
+                    </a:stretch>
+                  </pic:blipFill>
+                  <pic:spPr>
+                    <a:xfrm>
+                      <a:off x="0" y="0"/>
+                      <a:ext cx="5943600" cy="4371340"/>
+                    </a:xfrm>
+                    <a:prstGeom prst="rect">
+                      <a:avLst/>
+                    </a:prstGeom>
+                  </pic:spPr>
+                </pic:pic>
+              </a:graphicData>
+            </a:graphic>
+          </wp:inline>
+        </w:drawing>
+      </w:r>
+    </w:p>
+    <w:p/>
+    <w:p/>
     <w:sectPr>
       <w:pgSz w:w="12240" w:h="15840"/>
       <w:pgMar w:top="1440" w:right="1440" w:bottom="1440" w:left="1440" w:header="720" w:footer="720" w:gutter="0"/>

</xml_diff>

<commit_message>
feat(terraform): complete AWS platform bootstrap and dataplane infrastructure
</commit_message>
<xml_diff>
--- a/docs/retail-store-v2-validation-screenshots.docx
+++ b/docs/retail-store-v2-validation-screenshots.docx
@@ -802,6 +802,13 @@
       </w:pPr>
     </w:p>
     <w:p>
+      <w:pPr>
+        <w:rPr>
+          <w:b/>
+          <w:bCs/>
+          <w:color w:val="EE0000"/>
+        </w:rPr>
+      </w:pPr>
       <w:r>
         <w:rPr>
           <w:noProof/>
@@ -852,9 +859,19 @@
       </w:r>
     </w:p>
     <w:p>
-      <w:r>
-        <w:rPr>
-          <w:noProof/>
+      <w:pPr>
+        <w:rPr>
+          <w:b/>
+          <w:bCs/>
+          <w:color w:val="EE0000"/>
+        </w:rPr>
+      </w:pPr>
+      <w:r>
+        <w:rPr>
+          <w:b/>
+          <w:bCs/>
+          <w:noProof/>
+          <w:color w:val="EE0000"/>
         </w:rPr>
         <w:drawing>
           <wp:inline distT="0" distB="0" distL="0" distR="0" wp14:anchorId="4E81ED5E" wp14:editId="487D227B">
@@ -894,9 +911,19 @@
       </w:r>
     </w:p>
     <w:p>
-      <w:r>
-        <w:rPr>
-          <w:noProof/>
+      <w:pPr>
+        <w:rPr>
+          <w:b/>
+          <w:bCs/>
+          <w:color w:val="EE0000"/>
+        </w:rPr>
+      </w:pPr>
+      <w:r>
+        <w:rPr>
+          <w:b/>
+          <w:bCs/>
+          <w:noProof/>
+          <w:color w:val="EE0000"/>
         </w:rPr>
         <w:drawing>
           <wp:inline distT="0" distB="0" distL="0" distR="0" wp14:anchorId="021B4F22" wp14:editId="3FB1C13D">
@@ -936,9 +963,19 @@
       </w:r>
     </w:p>
     <w:p>
-      <w:r>
-        <w:rPr>
-          <w:noProof/>
+      <w:pPr>
+        <w:rPr>
+          <w:b/>
+          <w:bCs/>
+          <w:color w:val="EE0000"/>
+        </w:rPr>
+      </w:pPr>
+      <w:r>
+        <w:rPr>
+          <w:b/>
+          <w:bCs/>
+          <w:noProof/>
+          <w:color w:val="EE0000"/>
         </w:rPr>
         <w:lastRenderedPageBreak/>
         <w:drawing>
@@ -979,6 +1016,50 @@
       </w:r>
     </w:p>
     <w:p>
+      <w:pPr>
+        <w:rPr>
+          <w:b/>
+          <w:bCs/>
+          <w:color w:val="EE0000"/>
+        </w:rPr>
+      </w:pPr>
+    </w:p>
+    <w:p>
+      <w:pPr>
+        <w:rPr>
+          <w:b/>
+          <w:bCs/>
+          <w:color w:val="EE0000"/>
+        </w:rPr>
+      </w:pPr>
+      <w:r>
+        <w:rPr>
+          <w:b/>
+          <w:bCs/>
+          <w:color w:val="EE0000"/>
+        </w:rPr>
+        <w:t xml:space="preserve">feat(terraform): complete AWS platform bootstrap and </w:t>
+      </w:r>
+      <w:proofErr w:type="spellStart"/>
+      <w:r>
+        <w:rPr>
+          <w:b/>
+          <w:bCs/>
+          <w:color w:val="EE0000"/>
+        </w:rPr>
+        <w:t>dataplane</w:t>
+      </w:r>
+      <w:proofErr w:type="spellEnd"/>
+      <w:r>
+        <w:rPr>
+          <w:b/>
+          <w:bCs/>
+          <w:color w:val="EE0000"/>
+        </w:rPr>
+        <w:t xml:space="preserve"> infrastructure</w:t>
+      </w:r>
+    </w:p>
+    <w:p>
       <w:r>
         <w:t>feat(platform): bootstrap EKS cluster with Metrics Server and Pod Identity Agent</w:t>
       </w:r>
@@ -996,6 +1077,7 @@
         <w:rPr>
           <w:noProof/>
         </w:rPr>
+        <w:lastRenderedPageBreak/>
         <w:drawing>
           <wp:inline distT="0" distB="0" distL="0" distR="0" wp14:anchorId="5EBAC435" wp14:editId="70C44B38">
             <wp:extent cx="5943600" cy="5181600"/>
@@ -1038,7 +1120,6 @@
         <w:rPr>
           <w:noProof/>
         </w:rPr>
-        <w:lastRenderedPageBreak/>
         <w:drawing>
           <wp:inline distT="0" distB="0" distL="0" distR="0" wp14:anchorId="40E23F0F" wp14:editId="72D74573">
             <wp:extent cx="5943600" cy="2731135"/>
@@ -1078,23 +1159,42 @@
     </w:p>
     <w:p>
       <w:r>
+        <w:rPr>
+          <w:highlight w:val="yellow"/>
+        </w:rPr>
+        <w:lastRenderedPageBreak/>
         <w:t>P</w:t>
       </w:r>
       <w:r>
+        <w:rPr>
+          <w:highlight w:val="yellow"/>
+        </w:rPr>
         <w:t xml:space="preserve">od Identity Agent </w:t>
       </w:r>
       <w:r>
+        <w:rPr>
+          <w:highlight w:val="yellow"/>
+        </w:rPr>
         <w:t xml:space="preserve">installed and running as a </w:t>
       </w:r>
       <w:proofErr w:type="spellStart"/>
       <w:r>
+        <w:rPr>
+          <w:highlight w:val="yellow"/>
+        </w:rPr>
         <w:t>daemonset</w:t>
       </w:r>
       <w:proofErr w:type="spellEnd"/>
       <w:r>
+        <w:rPr>
+          <w:highlight w:val="yellow"/>
+        </w:rPr>
         <w:t xml:space="preserve"> on each node in the cluster</w:t>
       </w:r>
       <w:r>
+        <w:rPr>
+          <w:highlight w:val="yellow"/>
+        </w:rPr>
         <w:t xml:space="preserve"> for secured workload identity to AWS resources.</w:t>
       </w:r>
     </w:p>
@@ -1140,27 +1240,50 @@
         </w:drawing>
       </w:r>
     </w:p>
-    <w:p>
-      <w:r>
+    <w:p/>
+    <w:p/>
+    <w:p/>
+    <w:p/>
+    <w:p/>
+    <w:p>
+      <w:r>
+        <w:rPr>
+          <w:highlight w:val="yellow"/>
+        </w:rPr>
         <w:t xml:space="preserve">Pod Identity Association </w:t>
       </w:r>
       <w:r>
+        <w:rPr>
+          <w:highlight w:val="yellow"/>
+        </w:rPr>
         <w:t xml:space="preserve">for </w:t>
       </w:r>
       <w:proofErr w:type="spellStart"/>
       <w:r>
+        <w:rPr>
+          <w:highlight w:val="yellow"/>
+        </w:rPr>
         <w:t>ebs</w:t>
       </w:r>
       <w:proofErr w:type="spellEnd"/>
       <w:r>
+        <w:rPr>
+          <w:highlight w:val="yellow"/>
+        </w:rPr>
         <w:t>-</w:t>
       </w:r>
       <w:proofErr w:type="spellStart"/>
       <w:r>
+        <w:rPr>
+          <w:highlight w:val="yellow"/>
+        </w:rPr>
         <w:t>csi</w:t>
       </w:r>
       <w:proofErr w:type="spellEnd"/>
       <w:r>
+        <w:rPr>
+          <w:highlight w:val="yellow"/>
+        </w:rPr>
         <w:t>-driver</w:t>
       </w:r>
     </w:p>
@@ -1351,8 +1474,14 @@
     <w:p/>
     <w:p>
       <w:r>
+        <w:rPr>
+          <w:highlight w:val="yellow"/>
+        </w:rPr>
         <w:lastRenderedPageBreak/>
-        <w:t xml:space="preserve">feat(storage): implement Amazon EBS CSI Driver with EKS Pod Identity </w:t>
+        <w:t>feat(storage): implement Amazon EBS CSI Driver with EKS Pod Identity</w:t>
+      </w:r>
+      <w:r>
+        <w:t xml:space="preserve"> </w:t>
       </w:r>
       <w:r>
         <w:rPr>
@@ -1398,6 +1527,11 @@
     <w:p>
       <w:r>
         <w:br/>
+      </w:r>
+      <w:r>
+        <w:rPr>
+          <w:highlight w:val="yellow"/>
+        </w:rPr>
         <w:t>feat(storage): implement Amazon EBS CSI Driver with Pod Identity and dynamic gp3 provisioning</w:t>
       </w:r>
     </w:p>
@@ -1450,9 +1584,309 @@
         </w:rPr>
       </w:pPr>
       <w:r>
+        <w:rPr>
+          <w:noProof/>
+        </w:rPr>
+        <w:lastRenderedPageBreak/>
+        <w:t xml:space="preserve"> </w:t>
+      </w:r>
+      <w:r>
+        <w:rPr>
+          <w:noProof/>
+        </w:rPr>
+        <w:drawing>
+          <wp:inline distT="0" distB="0" distL="0" distR="0" wp14:anchorId="1EC25F45" wp14:editId="6FE651D0">
+            <wp:extent cx="5943600" cy="3752215"/>
+            <wp:effectExtent l="0" t="0" r="0" b="635"/>
+            <wp:docPr id="197480193" name="Picture 1"/>
+            <wp:cNvGraphicFramePr>
+              <a:graphicFrameLocks xmlns:a="http://schemas.openxmlformats.org/drawingml/2006/main" noChangeAspect="1"/>
+            </wp:cNvGraphicFramePr>
+            <a:graphic xmlns:a="http://schemas.openxmlformats.org/drawingml/2006/main">
+              <a:graphicData uri="http://schemas.openxmlformats.org/drawingml/2006/picture">
+                <pic:pic xmlns:pic="http://schemas.openxmlformats.org/drawingml/2006/picture">
+                  <pic:nvPicPr>
+                    <pic:cNvPr id="197480193" name=""/>
+                    <pic:cNvPicPr/>
+                  </pic:nvPicPr>
+                  <pic:blipFill>
+                    <a:blip r:embed="rId28"/>
+                    <a:stretch>
+                      <a:fillRect/>
+                    </a:stretch>
+                  </pic:blipFill>
+                  <pic:spPr>
+                    <a:xfrm>
+                      <a:off x="0" y="0"/>
+                      <a:ext cx="5943600" cy="3752215"/>
+                    </a:xfrm>
+                    <a:prstGeom prst="rect">
+                      <a:avLst/>
+                    </a:prstGeom>
+                  </pic:spPr>
+                </pic:pic>
+              </a:graphicData>
+            </a:graphic>
+          </wp:inline>
+        </w:drawing>
+      </w:r>
+    </w:p>
+    <w:p>
+      <w:pPr>
+        <w:rPr>
+          <w:noProof/>
+        </w:rPr>
+      </w:pPr>
+    </w:p>
+    <w:p>
+      <w:pPr>
+        <w:rPr>
+          <w:noProof/>
+        </w:rPr>
+      </w:pPr>
+    </w:p>
+    <w:p>
+      <w:pPr>
+        <w:rPr>
+          <w:noProof/>
+        </w:rPr>
+      </w:pPr>
+    </w:p>
+    <w:p>
+      <w:pPr>
+        <w:rPr>
+          <w:noProof/>
+        </w:rPr>
+      </w:pPr>
+    </w:p>
+    <w:p>
+      <w:pPr>
+        <w:rPr>
+          <w:noProof/>
+        </w:rPr>
+      </w:pPr>
+    </w:p>
+    <w:p>
+      <w:pPr>
+        <w:rPr>
+          <w:noProof/>
+        </w:rPr>
+      </w:pPr>
+    </w:p>
+    <w:p>
+      <w:pPr>
+        <w:rPr>
+          <w:noProof/>
+        </w:rPr>
+      </w:pPr>
+    </w:p>
+    <w:p>
+      <w:pPr>
+        <w:rPr>
+          <w:noProof/>
+        </w:rPr>
+      </w:pPr>
+    </w:p>
+    <w:p>
+      <w:pPr>
+        <w:rPr>
+          <w:noProof/>
+        </w:rPr>
+      </w:pPr>
+    </w:p>
+    <w:p>
+      <w:pPr>
+        <w:rPr>
+          <w:noProof/>
+        </w:rPr>
+      </w:pPr>
+    </w:p>
+    <w:p>
+      <w:pPr>
+        <w:rPr>
+          <w:noProof/>
+        </w:rPr>
+      </w:pPr>
+    </w:p>
+    <w:p>
+      <w:pPr>
+        <w:rPr>
+          <w:noProof/>
+        </w:rPr>
+      </w:pPr>
+    </w:p>
+    <w:p>
+      <w:pPr>
+        <w:rPr>
+          <w:noProof/>
+        </w:rPr>
+      </w:pPr>
+    </w:p>
+    <w:p>
+      <w:pPr>
+        <w:rPr>
+          <w:noProof/>
+        </w:rPr>
+      </w:pPr>
+      <w:r>
+        <w:rPr>
+          <w:noProof/>
+        </w:rPr>
+        <w:lastRenderedPageBreak/>
+        <w:t>"feat(platform): automate EKS platform bootstrap with Terraform"</w:t>
+      </w:r>
+    </w:p>
+    <w:p>
+      <w:r>
+        <w:rPr>
+          <w:noProof/>
+        </w:rPr>
+        <w:drawing>
+          <wp:inline distT="0" distB="0" distL="0" distR="0" wp14:anchorId="3A836E9A" wp14:editId="7C42B262">
+            <wp:extent cx="5943600" cy="4371340"/>
+            <wp:effectExtent l="0" t="0" r="0" b="0"/>
+            <wp:docPr id="711808844" name="Picture 1"/>
+            <wp:cNvGraphicFramePr>
+              <a:graphicFrameLocks xmlns:a="http://schemas.openxmlformats.org/drawingml/2006/main" noChangeAspect="1"/>
+            </wp:cNvGraphicFramePr>
+            <a:graphic xmlns:a="http://schemas.openxmlformats.org/drawingml/2006/main">
+              <a:graphicData uri="http://schemas.openxmlformats.org/drawingml/2006/picture">
+                <pic:pic xmlns:pic="http://schemas.openxmlformats.org/drawingml/2006/picture">
+                  <pic:nvPicPr>
+                    <pic:cNvPr id="711808844" name=""/>
+                    <pic:cNvPicPr/>
+                  </pic:nvPicPr>
+                  <pic:blipFill>
+                    <a:blip r:embed="rId29"/>
+                    <a:stretch>
+                      <a:fillRect/>
+                    </a:stretch>
+                  </pic:blipFill>
+                  <pic:spPr>
+                    <a:xfrm>
+                      <a:off x="0" y="0"/>
+                      <a:ext cx="5943600" cy="4371340"/>
+                    </a:xfrm>
+                    <a:prstGeom prst="rect">
+                      <a:avLst/>
+                    </a:prstGeom>
+                  </pic:spPr>
+                </pic:pic>
+              </a:graphicData>
+            </a:graphic>
+          </wp:inline>
+        </w:drawing>
+      </w:r>
+    </w:p>
+    <w:p/>
+    <w:p>
+      <w:r>
+        <w:drawing>
+          <wp:inline distT="0" distB="0" distL="0" distR="0" wp14:anchorId="6D62DBA6" wp14:editId="37B38ADD">
+            <wp:extent cx="5943600" cy="1727200"/>
+            <wp:effectExtent l="0" t="0" r="0" b="6350"/>
+            <wp:docPr id="192344711" name="Picture 1"/>
+            <wp:cNvGraphicFramePr>
+              <a:graphicFrameLocks xmlns:a="http://schemas.openxmlformats.org/drawingml/2006/main" noChangeAspect="1"/>
+            </wp:cNvGraphicFramePr>
+            <a:graphic xmlns:a="http://schemas.openxmlformats.org/drawingml/2006/main">
+              <a:graphicData uri="http://schemas.openxmlformats.org/drawingml/2006/picture">
+                <pic:pic xmlns:pic="http://schemas.openxmlformats.org/drawingml/2006/picture">
+                  <pic:nvPicPr>
+                    <pic:cNvPr id="192344711" name=""/>
+                    <pic:cNvPicPr/>
+                  </pic:nvPicPr>
+                  <pic:blipFill>
+                    <a:blip r:embed="rId30"/>
+                    <a:stretch>
+                      <a:fillRect/>
+                    </a:stretch>
+                  </pic:blipFill>
+                  <pic:spPr>
+                    <a:xfrm>
+                      <a:off x="0" y="0"/>
+                      <a:ext cx="5943600" cy="1727200"/>
+                    </a:xfrm>
+                    <a:prstGeom prst="rect">
+                      <a:avLst/>
+                    </a:prstGeom>
+                  </pic:spPr>
+                </pic:pic>
+              </a:graphicData>
+            </a:graphic>
+          </wp:inline>
+        </w:drawing>
+      </w:r>
+    </w:p>
+    <w:p>
+      <w:r>
         <w:lastRenderedPageBreak/>
         <w:drawing>
-          <wp:inline distT="0" distB="0" distL="0" distR="0" wp14:anchorId="0CE191C7" wp14:editId="4CB2E81D">
+          <wp:inline distT="0" distB="0" distL="0" distR="0" wp14:anchorId="66214814" wp14:editId="048C0C3F">
+            <wp:extent cx="5943600" cy="1719580"/>
+            <wp:effectExtent l="0" t="0" r="0" b="0"/>
+            <wp:docPr id="1643957037" name="Picture 1"/>
+            <wp:cNvGraphicFramePr>
+              <a:graphicFrameLocks xmlns:a="http://schemas.openxmlformats.org/drawingml/2006/main" noChangeAspect="1"/>
+            </wp:cNvGraphicFramePr>
+            <a:graphic xmlns:a="http://schemas.openxmlformats.org/drawingml/2006/main">
+              <a:graphicData uri="http://schemas.openxmlformats.org/drawingml/2006/picture">
+                <pic:pic xmlns:pic="http://schemas.openxmlformats.org/drawingml/2006/picture">
+                  <pic:nvPicPr>
+                    <pic:cNvPr id="1643957037" name=""/>
+                    <pic:cNvPicPr/>
+                  </pic:nvPicPr>
+                  <pic:blipFill>
+                    <a:blip r:embed="rId31"/>
+                    <a:stretch>
+                      <a:fillRect/>
+                    </a:stretch>
+                  </pic:blipFill>
+                  <pic:spPr>
+                    <a:xfrm>
+                      <a:off x="0" y="0"/>
+                      <a:ext cx="5943600" cy="1719580"/>
+                    </a:xfrm>
+                    <a:prstGeom prst="rect">
+                      <a:avLst/>
+                    </a:prstGeom>
+                  </pic:spPr>
+                </pic:pic>
+              </a:graphicData>
+            </a:graphic>
+          </wp:inline>
+        </w:drawing>
+      </w:r>
+    </w:p>
+    <w:p>
+      <w:r>
+        <w:rPr>
+          <w:highlight w:val="yellow"/>
+        </w:rPr>
+        <w:t xml:space="preserve">MySQL RDS </w:t>
+      </w:r>
+      <w:proofErr w:type="spellStart"/>
+      <w:r>
+        <w:rPr>
+          <w:highlight w:val="yellow"/>
+        </w:rPr>
+        <w:t>db</w:t>
+      </w:r>
+      <w:proofErr w:type="spellEnd"/>
+      <w:r>
+        <w:rPr>
+          <w:highlight w:val="yellow"/>
+        </w:rPr>
+        <w:t xml:space="preserve"> ASM</w:t>
+      </w:r>
+    </w:p>
+    <w:p>
+      <w:r>
+        <w:rPr>
+          <w:noProof/>
+        </w:rPr>
+        <w:drawing>
+          <wp:inline distT="0" distB="0" distL="0" distR="0" wp14:anchorId="65C0FFD9" wp14:editId="68457867">
             <wp:extent cx="5943600" cy="4638040"/>
             <wp:effectExtent l="0" t="0" r="0" b="0"/>
             <wp:docPr id="1077018310" name="Picture 1"/>
@@ -1467,7 +1901,7 @@
                     <pic:cNvPicPr/>
                   </pic:nvPicPr>
                   <pic:blipFill>
-                    <a:blip r:embed="rId28"/>
+                    <a:blip r:embed="rId32"/>
                     <a:stretch>
                       <a:fillRect/>
                     </a:stretch>
@@ -1487,19 +1921,48 @@
           </wp:inline>
         </w:drawing>
       </w:r>
-      <w:r>
-        <w:rPr>
-          <w:noProof/>
-        </w:rPr>
-        <w:t xml:space="preserve"> </w:t>
-      </w:r>
-      <w:r>
+    </w:p>
+    <w:p/>
+    <w:p/>
+    <w:p/>
+    <w:p/>
+    <w:p>
+      <w:r>
+        <w:rPr>
+          <w:noProof/>
+          <w:highlight w:val="yellow"/>
+        </w:rPr>
         <w:lastRenderedPageBreak/>
+        <w:t>PostgreSQL</w:t>
+      </w:r>
+      <w:r>
+        <w:rPr>
+          <w:highlight w:val="yellow"/>
+        </w:rPr>
+        <w:t xml:space="preserve"> RDS </w:t>
+      </w:r>
+      <w:proofErr w:type="spellStart"/>
+      <w:r>
+        <w:rPr>
+          <w:highlight w:val="yellow"/>
+        </w:rPr>
+        <w:t>db</w:t>
+      </w:r>
+      <w:proofErr w:type="spellEnd"/>
+      <w:r>
+        <w:rPr>
+          <w:highlight w:val="yellow"/>
+        </w:rPr>
+        <w:t xml:space="preserve"> ASM</w:t>
+      </w:r>
+    </w:p>
+    <w:p>
+      <w:r>
         <w:drawing>
-          <wp:inline distT="0" distB="0" distL="0" distR="0" wp14:anchorId="1EC25F45" wp14:editId="6FE651D0">
-            <wp:extent cx="5943600" cy="3752215"/>
-            <wp:effectExtent l="0" t="0" r="0" b="635"/>
-            <wp:docPr id="197480193" name="Picture 1"/>
+          <wp:inline distT="0" distB="0" distL="0" distR="0" wp14:anchorId="5D811B9F" wp14:editId="3D0D95B4">
+            <wp:extent cx="4874400" cy="3753184"/>
+            <wp:effectExtent l="0" t="0" r="2540" b="0"/>
+            <wp:docPr id="1642502198" name="Picture 1"/>
             <wp:cNvGraphicFramePr>
               <a:graphicFrameLocks xmlns:a="http://schemas.openxmlformats.org/drawingml/2006/main" noChangeAspect="1"/>
             </wp:cNvGraphicFramePr>
@@ -1507,11 +1970,11 @@
               <a:graphicData uri="http://schemas.openxmlformats.org/drawingml/2006/picture">
                 <pic:pic xmlns:pic="http://schemas.openxmlformats.org/drawingml/2006/picture">
                   <pic:nvPicPr>
-                    <pic:cNvPr id="197480193" name=""/>
+                    <pic:cNvPr id="1642502198" name=""/>
                     <pic:cNvPicPr/>
                   </pic:nvPicPr>
                   <pic:blipFill>
-                    <a:blip r:embed="rId29"/>
+                    <a:blip r:embed="rId33"/>
                     <a:stretch>
                       <a:fillRect/>
                     </a:stretch>
@@ -1519,7 +1982,7 @@
                   <pic:spPr>
                     <a:xfrm>
                       <a:off x="0" y="0"/>
-                      <a:ext cx="5943600" cy="3752215"/>
+                      <a:ext cx="4881979" cy="3759020"/>
                     </a:xfrm>
                     <a:prstGeom prst="rect">
                       <a:avLst/>
@@ -1533,124 +1996,28 @@
       </w:r>
     </w:p>
     <w:p>
-      <w:pPr>
-        <w:rPr>
-          <w:noProof/>
-        </w:rPr>
-      </w:pPr>
-    </w:p>
-    <w:p>
-      <w:pPr>
-        <w:rPr>
-          <w:noProof/>
-        </w:rPr>
-      </w:pPr>
-    </w:p>
-    <w:p>
-      <w:pPr>
-        <w:rPr>
-          <w:noProof/>
-        </w:rPr>
-      </w:pPr>
-    </w:p>
-    <w:p>
-      <w:pPr>
-        <w:rPr>
-          <w:noProof/>
-        </w:rPr>
-      </w:pPr>
-    </w:p>
-    <w:p>
-      <w:pPr>
-        <w:rPr>
-          <w:noProof/>
-        </w:rPr>
-      </w:pPr>
-    </w:p>
-    <w:p>
-      <w:pPr>
-        <w:rPr>
-          <w:noProof/>
-        </w:rPr>
-      </w:pPr>
-    </w:p>
-    <w:p>
-      <w:pPr>
-        <w:rPr>
-          <w:noProof/>
-        </w:rPr>
-      </w:pPr>
-    </w:p>
-    <w:p>
-      <w:pPr>
-        <w:rPr>
-          <w:noProof/>
-        </w:rPr>
-      </w:pPr>
-    </w:p>
-    <w:p>
-      <w:pPr>
-        <w:rPr>
-          <w:noProof/>
-        </w:rPr>
-      </w:pPr>
-    </w:p>
-    <w:p>
-      <w:pPr>
-        <w:rPr>
-          <w:noProof/>
-        </w:rPr>
-      </w:pPr>
-    </w:p>
-    <w:p>
-      <w:pPr>
-        <w:rPr>
-          <w:noProof/>
-        </w:rPr>
-      </w:pPr>
-    </w:p>
-    <w:p>
-      <w:pPr>
-        <w:rPr>
-          <w:noProof/>
-        </w:rPr>
-      </w:pPr>
-    </w:p>
-    <w:p>
-      <w:pPr>
-        <w:rPr>
-          <w:noProof/>
-        </w:rPr>
-      </w:pPr>
-    </w:p>
-    <w:p>
-      <w:pPr>
-        <w:rPr>
-          <w:noProof/>
-        </w:rPr>
-      </w:pPr>
-    </w:p>
-    <w:p>
-      <w:pPr>
-        <w:rPr>
-          <w:noProof/>
-        </w:rPr>
-      </w:pPr>
-      <w:r>
-        <w:rPr>
-          <w:noProof/>
-        </w:rPr>
-        <w:lastRenderedPageBreak/>
-        <w:t>"feat(platform): automate EKS platform bootstrap with Terraform"</w:t>
-      </w:r>
+      <w:r>
+        <w:rPr>
+          <w:highlight w:val="yellow"/>
+        </w:rPr>
+        <w:t xml:space="preserve">MySQL and PostgreSQL RD </w:t>
+      </w:r>
+      <w:proofErr w:type="spellStart"/>
+      <w:r>
+        <w:rPr>
+          <w:highlight w:val="yellow"/>
+        </w:rPr>
+        <w:t>dbs</w:t>
+      </w:r>
+      <w:proofErr w:type="spellEnd"/>
     </w:p>
     <w:p>
       <w:r>
         <w:drawing>
-          <wp:inline distT="0" distB="0" distL="0" distR="0" wp14:anchorId="3A836E9A" wp14:editId="7C42B262">
-            <wp:extent cx="5943600" cy="4371340"/>
-            <wp:effectExtent l="0" t="0" r="0" b="0"/>
-            <wp:docPr id="711808844" name="Picture 1"/>
+          <wp:inline distT="0" distB="0" distL="0" distR="0" wp14:anchorId="61BA3273" wp14:editId="1F8DE17A">
+            <wp:extent cx="5943600" cy="2150745"/>
+            <wp:effectExtent l="0" t="0" r="0" b="1905"/>
+            <wp:docPr id="1124789883" name="Picture 1"/>
             <wp:cNvGraphicFramePr>
               <a:graphicFrameLocks xmlns:a="http://schemas.openxmlformats.org/drawingml/2006/main" noChangeAspect="1"/>
             </wp:cNvGraphicFramePr>
@@ -1658,11 +2025,11 @@
               <a:graphicData uri="http://schemas.openxmlformats.org/drawingml/2006/picture">
                 <pic:pic xmlns:pic="http://schemas.openxmlformats.org/drawingml/2006/picture">
                   <pic:nvPicPr>
-                    <pic:cNvPr id="711808844" name=""/>
+                    <pic:cNvPr id="1124789883" name=""/>
                     <pic:cNvPicPr/>
                   </pic:nvPicPr>
                   <pic:blipFill>
-                    <a:blip r:embed="rId30"/>
+                    <a:blip r:embed="rId34"/>
                     <a:stretch>
                       <a:fillRect/>
                     </a:stretch>
@@ -1670,7 +2037,7 @@
                   <pic:spPr>
                     <a:xfrm>
                       <a:off x="0" y="0"/>
-                      <a:ext cx="5943600" cy="4371340"/>
+                      <a:ext cx="5943600" cy="2150745"/>
                     </a:xfrm>
                     <a:prstGeom prst="rect">
                       <a:avLst/>
@@ -1683,8 +2050,390 @@
         </w:drawing>
       </w:r>
     </w:p>
-    <w:p/>
-    <w:p/>
+    <w:p>
+      <w:r>
+        <w:lastRenderedPageBreak/>
+        <w:drawing>
+          <wp:inline distT="0" distB="0" distL="0" distR="0" wp14:anchorId="62605666" wp14:editId="55CACF71">
+            <wp:extent cx="5943600" cy="1548130"/>
+            <wp:effectExtent l="0" t="0" r="0" b="0"/>
+            <wp:docPr id="1710717695" name="Picture 1"/>
+            <wp:cNvGraphicFramePr>
+              <a:graphicFrameLocks xmlns:a="http://schemas.openxmlformats.org/drawingml/2006/main" noChangeAspect="1"/>
+            </wp:cNvGraphicFramePr>
+            <a:graphic xmlns:a="http://schemas.openxmlformats.org/drawingml/2006/main">
+              <a:graphicData uri="http://schemas.openxmlformats.org/drawingml/2006/picture">
+                <pic:pic xmlns:pic="http://schemas.openxmlformats.org/drawingml/2006/picture">
+                  <pic:nvPicPr>
+                    <pic:cNvPr id="1710717695" name=""/>
+                    <pic:cNvPicPr/>
+                  </pic:nvPicPr>
+                  <pic:blipFill>
+                    <a:blip r:embed="rId35"/>
+                    <a:stretch>
+                      <a:fillRect/>
+                    </a:stretch>
+                  </pic:blipFill>
+                  <pic:spPr>
+                    <a:xfrm>
+                      <a:off x="0" y="0"/>
+                      <a:ext cx="5943600" cy="1548130"/>
+                    </a:xfrm>
+                    <a:prstGeom prst="rect">
+                      <a:avLst/>
+                    </a:prstGeom>
+                  </pic:spPr>
+                </pic:pic>
+              </a:graphicData>
+            </a:graphic>
+          </wp:inline>
+        </w:drawing>
+      </w:r>
+    </w:p>
+    <w:p>
+      <w:proofErr w:type="spellStart"/>
+      <w:r>
+        <w:rPr>
+          <w:highlight w:val="yellow"/>
+        </w:rPr>
+        <w:t>Dynamodb</w:t>
+      </w:r>
+      <w:proofErr w:type="spellEnd"/>
+      <w:r>
+        <w:rPr>
+          <w:highlight w:val="yellow"/>
+        </w:rPr>
+        <w:t xml:space="preserve"> table:</w:t>
+      </w:r>
+    </w:p>
+    <w:p>
+      <w:r>
+        <w:drawing>
+          <wp:inline distT="0" distB="0" distL="0" distR="0" wp14:anchorId="187F4BD1" wp14:editId="00DC70A4">
+            <wp:extent cx="5943600" cy="2620645"/>
+            <wp:effectExtent l="0" t="0" r="0" b="8255"/>
+            <wp:docPr id="1479548114" name="Picture 1"/>
+            <wp:cNvGraphicFramePr>
+              <a:graphicFrameLocks xmlns:a="http://schemas.openxmlformats.org/drawingml/2006/main" noChangeAspect="1"/>
+            </wp:cNvGraphicFramePr>
+            <a:graphic xmlns:a="http://schemas.openxmlformats.org/drawingml/2006/main">
+              <a:graphicData uri="http://schemas.openxmlformats.org/drawingml/2006/picture">
+                <pic:pic xmlns:pic="http://schemas.openxmlformats.org/drawingml/2006/picture">
+                  <pic:nvPicPr>
+                    <pic:cNvPr id="1479548114" name=""/>
+                    <pic:cNvPicPr/>
+                  </pic:nvPicPr>
+                  <pic:blipFill>
+                    <a:blip r:embed="rId36"/>
+                    <a:stretch>
+                      <a:fillRect/>
+                    </a:stretch>
+                  </pic:blipFill>
+                  <pic:spPr>
+                    <a:xfrm>
+                      <a:off x="0" y="0"/>
+                      <a:ext cx="5943600" cy="2620645"/>
+                    </a:xfrm>
+                    <a:prstGeom prst="rect">
+                      <a:avLst/>
+                    </a:prstGeom>
+                  </pic:spPr>
+                </pic:pic>
+              </a:graphicData>
+            </a:graphic>
+          </wp:inline>
+        </w:drawing>
+      </w:r>
+    </w:p>
+    <w:p>
+      <w:r>
+        <w:drawing>
+          <wp:inline distT="0" distB="0" distL="0" distR="0" wp14:anchorId="4627D323" wp14:editId="022B7488">
+            <wp:extent cx="5943600" cy="1364615"/>
+            <wp:effectExtent l="0" t="0" r="0" b="6985"/>
+            <wp:docPr id="851188526" name="Picture 1"/>
+            <wp:cNvGraphicFramePr>
+              <a:graphicFrameLocks xmlns:a="http://schemas.openxmlformats.org/drawingml/2006/main" noChangeAspect="1"/>
+            </wp:cNvGraphicFramePr>
+            <a:graphic xmlns:a="http://schemas.openxmlformats.org/drawingml/2006/main">
+              <a:graphicData uri="http://schemas.openxmlformats.org/drawingml/2006/picture">
+                <pic:pic xmlns:pic="http://schemas.openxmlformats.org/drawingml/2006/picture">
+                  <pic:nvPicPr>
+                    <pic:cNvPr id="851188526" name=""/>
+                    <pic:cNvPicPr/>
+                  </pic:nvPicPr>
+                  <pic:blipFill>
+                    <a:blip r:embed="rId37"/>
+                    <a:stretch>
+                      <a:fillRect/>
+                    </a:stretch>
+                  </pic:blipFill>
+                  <pic:spPr>
+                    <a:xfrm>
+                      <a:off x="0" y="0"/>
+                      <a:ext cx="5943600" cy="1364615"/>
+                    </a:xfrm>
+                    <a:prstGeom prst="rect">
+                      <a:avLst/>
+                    </a:prstGeom>
+                  </pic:spPr>
+                </pic:pic>
+              </a:graphicData>
+            </a:graphic>
+          </wp:inline>
+        </w:drawing>
+      </w:r>
+    </w:p>
+    <w:p/>
+    <w:p/>
+    <w:p/>
+    <w:p/>
+    <w:p/>
+    <w:p/>
+    <w:p>
+      <w:pPr>
+        <w:rPr>
+          <w:highlight w:val="yellow"/>
+        </w:rPr>
+      </w:pPr>
+      <w:r>
+        <w:rPr>
+          <w:highlight w:val="yellow"/>
+        </w:rPr>
+        <w:lastRenderedPageBreak/>
+        <w:t>Redis Elastic Cache</w:t>
+      </w:r>
+    </w:p>
+    <w:p>
+      <w:pPr>
+        <w:rPr>
+          <w:highlight w:val="yellow"/>
+        </w:rPr>
+      </w:pPr>
+      <w:r>
+        <w:drawing>
+          <wp:inline distT="0" distB="0" distL="0" distR="0" wp14:anchorId="5579486C" wp14:editId="223A61B0">
+            <wp:extent cx="5943600" cy="3646805"/>
+            <wp:effectExtent l="0" t="0" r="0" b="0"/>
+            <wp:docPr id="1456737266" name="Picture 1"/>
+            <wp:cNvGraphicFramePr>
+              <a:graphicFrameLocks xmlns:a="http://schemas.openxmlformats.org/drawingml/2006/main" noChangeAspect="1"/>
+            </wp:cNvGraphicFramePr>
+            <a:graphic xmlns:a="http://schemas.openxmlformats.org/drawingml/2006/main">
+              <a:graphicData uri="http://schemas.openxmlformats.org/drawingml/2006/picture">
+                <pic:pic xmlns:pic="http://schemas.openxmlformats.org/drawingml/2006/picture">
+                  <pic:nvPicPr>
+                    <pic:cNvPr id="1456737266" name=""/>
+                    <pic:cNvPicPr/>
+                  </pic:nvPicPr>
+                  <pic:blipFill>
+                    <a:blip r:embed="rId38"/>
+                    <a:stretch>
+                      <a:fillRect/>
+                    </a:stretch>
+                  </pic:blipFill>
+                  <pic:spPr>
+                    <a:xfrm>
+                      <a:off x="0" y="0"/>
+                      <a:ext cx="5943600" cy="3646805"/>
+                    </a:xfrm>
+                    <a:prstGeom prst="rect">
+                      <a:avLst/>
+                    </a:prstGeom>
+                  </pic:spPr>
+                </pic:pic>
+              </a:graphicData>
+            </a:graphic>
+          </wp:inline>
+        </w:drawing>
+      </w:r>
+    </w:p>
+    <w:p>
+      <w:pPr>
+        <w:rPr>
+          <w:highlight w:val="yellow"/>
+        </w:rPr>
+      </w:pPr>
+    </w:p>
+    <w:p>
+      <w:pPr>
+        <w:rPr>
+          <w:highlight w:val="yellow"/>
+        </w:rPr>
+      </w:pPr>
+    </w:p>
+    <w:p>
+      <w:pPr>
+        <w:rPr>
+          <w:highlight w:val="yellow"/>
+        </w:rPr>
+      </w:pPr>
+    </w:p>
+    <w:p>
+      <w:pPr>
+        <w:rPr>
+          <w:highlight w:val="yellow"/>
+        </w:rPr>
+      </w:pPr>
+    </w:p>
+    <w:p>
+      <w:pPr>
+        <w:rPr>
+          <w:highlight w:val="yellow"/>
+        </w:rPr>
+      </w:pPr>
+    </w:p>
+    <w:p>
+      <w:pPr>
+        <w:rPr>
+          <w:highlight w:val="yellow"/>
+        </w:rPr>
+      </w:pPr>
+    </w:p>
+    <w:p>
+      <w:pPr>
+        <w:rPr>
+          <w:highlight w:val="yellow"/>
+        </w:rPr>
+      </w:pPr>
+    </w:p>
+    <w:p>
+      <w:pPr>
+        <w:rPr>
+          <w:highlight w:val="yellow"/>
+        </w:rPr>
+      </w:pPr>
+    </w:p>
+    <w:p>
+      <w:pPr>
+        <w:rPr>
+          <w:highlight w:val="yellow"/>
+        </w:rPr>
+      </w:pPr>
+    </w:p>
+    <w:p>
+      <w:pPr>
+        <w:rPr>
+          <w:highlight w:val="yellow"/>
+        </w:rPr>
+      </w:pPr>
+    </w:p>
+    <w:p>
+      <w:pPr>
+        <w:rPr>
+          <w:highlight w:val="yellow"/>
+        </w:rPr>
+      </w:pPr>
+    </w:p>
+    <w:p>
+      <w:pPr>
+        <w:rPr>
+          <w:highlight w:val="yellow"/>
+        </w:rPr>
+      </w:pPr>
+    </w:p>
+    <w:p>
+      <w:pPr>
+        <w:rPr>
+          <w:highlight w:val="yellow"/>
+        </w:rPr>
+      </w:pPr>
+    </w:p>
+    <w:p>
+      <w:r>
+        <w:rPr>
+          <w:highlight w:val="yellow"/>
+        </w:rPr>
+        <w:lastRenderedPageBreak/>
+        <w:t>Remote state files</w:t>
+      </w:r>
+    </w:p>
+    <w:p>
+      <w:r>
+        <w:drawing>
+          <wp:inline distT="0" distB="0" distL="0" distR="0" wp14:anchorId="4A4D6367" wp14:editId="15EB52D8">
+            <wp:extent cx="5677692" cy="3991532"/>
+            <wp:effectExtent l="0" t="0" r="0" b="9525"/>
+            <wp:docPr id="1923987399" name="Picture 1"/>
+            <wp:cNvGraphicFramePr>
+              <a:graphicFrameLocks xmlns:a="http://schemas.openxmlformats.org/drawingml/2006/main" noChangeAspect="1"/>
+            </wp:cNvGraphicFramePr>
+            <a:graphic xmlns:a="http://schemas.openxmlformats.org/drawingml/2006/main">
+              <a:graphicData uri="http://schemas.openxmlformats.org/drawingml/2006/picture">
+                <pic:pic xmlns:pic="http://schemas.openxmlformats.org/drawingml/2006/picture">
+                  <pic:nvPicPr>
+                    <pic:cNvPr id="1923987399" name=""/>
+                    <pic:cNvPicPr/>
+                  </pic:nvPicPr>
+                  <pic:blipFill>
+                    <a:blip r:embed="rId39"/>
+                    <a:stretch>
+                      <a:fillRect/>
+                    </a:stretch>
+                  </pic:blipFill>
+                  <pic:spPr>
+                    <a:xfrm>
+                      <a:off x="0" y="0"/>
+                      <a:ext cx="5677692" cy="3991532"/>
+                    </a:xfrm>
+                    <a:prstGeom prst="rect">
+                      <a:avLst/>
+                    </a:prstGeom>
+                  </pic:spPr>
+                </pic:pic>
+              </a:graphicData>
+            </a:graphic>
+          </wp:inline>
+        </w:drawing>
+      </w:r>
+    </w:p>
+    <w:p>
+      <w:r>
+        <w:drawing>
+          <wp:inline distT="0" distB="0" distL="0" distR="0" wp14:anchorId="27419C95" wp14:editId="2AEE2A54">
+            <wp:extent cx="5943600" cy="2460625"/>
+            <wp:effectExtent l="0" t="0" r="0" b="0"/>
+            <wp:docPr id="1246523317" name="Picture 1"/>
+            <wp:cNvGraphicFramePr>
+              <a:graphicFrameLocks xmlns:a="http://schemas.openxmlformats.org/drawingml/2006/main" noChangeAspect="1"/>
+            </wp:cNvGraphicFramePr>
+            <a:graphic xmlns:a="http://schemas.openxmlformats.org/drawingml/2006/main">
+              <a:graphicData uri="http://schemas.openxmlformats.org/drawingml/2006/picture">
+                <pic:pic xmlns:pic="http://schemas.openxmlformats.org/drawingml/2006/picture">
+                  <pic:nvPicPr>
+                    <pic:cNvPr id="1246523317" name=""/>
+                    <pic:cNvPicPr/>
+                  </pic:nvPicPr>
+                  <pic:blipFill>
+                    <a:blip r:embed="rId40"/>
+                    <a:stretch>
+                      <a:fillRect/>
+                    </a:stretch>
+                  </pic:blipFill>
+                  <pic:spPr>
+                    <a:xfrm>
+                      <a:off x="0" y="0"/>
+                      <a:ext cx="5943600" cy="2460625"/>
+                    </a:xfrm>
+                    <a:prstGeom prst="rect">
+                      <a:avLst/>
+                    </a:prstGeom>
+                  </pic:spPr>
+                </pic:pic>
+              </a:graphicData>
+            </a:graphic>
+          </wp:inline>
+        </w:drawing>
+      </w:r>
+    </w:p>
+    <w:p>
+      <w:r>
+        <w:rPr>
+          <w:noProof/>
+        </w:rPr>
+        <w:t xml:space="preserve"> </w:t>
+      </w:r>
+    </w:p>
     <w:sectPr>
       <w:pgSz w:w="12240" w:h="15840"/>
       <w:pgMar w:top="1440" w:right="1440" w:bottom="1440" w:left="1440" w:header="720" w:footer="720" w:gutter="0"/>
@@ -2298,6 +3047,7 @@
   <w:style w:type="character" w:default="1" w:styleId="DefaultParagraphFont">
     <w:name w:val="Default Paragraph Font"/>
     <w:uiPriority w:val="1"/>
+    <w:semiHidden/>
     <w:unhideWhenUsed/>
   </w:style>
   <w:style w:type="table" w:default="1" w:styleId="TableNormal">

</xml_diff>

<commit_message>
doc:complete AWS platform bootstrap and dataplane infrastructure
</commit_message>
<xml_diff>
--- a/docs/retail-store-v2-validation-screenshots.docx
+++ b/docs/retail-store-v2-validation-screenshots.docx
@@ -12,50 +12,34 @@
         <w:rPr>
           <w:color w:val="EE0000"/>
         </w:rPr>
-        <w:t xml:space="preserve">feat: add Retail Store v2 application source and production </w:t>
-      </w:r>
-      <w:proofErr w:type="spellStart"/>
-      <w:r>
+        <w:t>feat: add Retail Store v2 application source and production Dockerfiles</w:t>
+      </w:r>
+    </w:p>
+    <w:p>
+      <w:pPr>
         <w:rPr>
           <w:color w:val="EE0000"/>
         </w:rPr>
-        <w:t>Dockerfiles</w:t>
-      </w:r>
-      <w:proofErr w:type="spellEnd"/>
-    </w:p>
-    <w:p>
-      <w:pPr>
+      </w:pPr>
+      <w:r>
         <w:rPr>
           <w:color w:val="EE0000"/>
         </w:rPr>
-      </w:pPr>
-      <w:r>
+        <w:t>- Add Retail Store v2 application source code</w:t>
+      </w:r>
+    </w:p>
+    <w:p>
+      <w:pPr>
         <w:rPr>
           <w:color w:val="EE0000"/>
         </w:rPr>
-        <w:t>- Add Retail Store v2 application source code</w:t>
-      </w:r>
-    </w:p>
-    <w:p>
-      <w:pPr>
+      </w:pPr>
+      <w:r>
         <w:rPr>
           <w:color w:val="EE0000"/>
         </w:rPr>
-      </w:pPr>
-      <w:r>
-        <w:rPr>
-          <w:color w:val="EE0000"/>
-        </w:rPr>
-        <w:t xml:space="preserve">- Implement production-grade multi-stage </w:t>
-      </w:r>
-      <w:proofErr w:type="spellStart"/>
-      <w:r>
-        <w:rPr>
-          <w:color w:val="EE0000"/>
-        </w:rPr>
-        <w:t>Dockerfiles</w:t>
-      </w:r>
-      <w:proofErr w:type="spellEnd"/>
+        <w:t>- Implement production-grade multi-stage Dockerfiles</w:t>
+      </w:r>
     </w:p>
     <w:p>
       <w:pPr>
@@ -130,53 +114,32 @@
           <w:bCs/>
           <w:highlight w:val="yellow"/>
         </w:rPr>
-        <w:t xml:space="preserve">Docker </w:t>
-      </w:r>
-      <w:proofErr w:type="gramStart"/>
+        <w:t>Docker compose implementation</w:t>
+      </w:r>
       <w:r>
         <w:rPr>
           <w:b/>
           <w:bCs/>
           <w:highlight w:val="yellow"/>
         </w:rPr>
-        <w:t>compose</w:t>
-      </w:r>
-      <w:proofErr w:type="gramEnd"/>
-      <w:r>
-        <w:rPr>
-          <w:b/>
-          <w:bCs/>
-          <w:highlight w:val="yellow"/>
-        </w:rPr>
-        <w:t xml:space="preserve"> implementation</w:t>
-      </w:r>
-      <w:r>
-        <w:rPr>
-          <w:b/>
-          <w:bCs/>
-          <w:highlight w:val="yellow"/>
-        </w:rPr>
         <w:t xml:space="preserve"> and validations:</w:t>
       </w:r>
     </w:p>
     <w:p>
       <w:r>
-        <w:rPr>
-          <w:noProof/>
-        </w:rPr>
-        <w:drawing>
-          <wp:inline distT="0" distB="0" distL="0" distR="0" wp14:anchorId="03403DEF" wp14:editId="73D7B0CD">
-            <wp:extent cx="5943600" cy="3013075"/>
+        <w:drawing>
+          <wp:inline distT="0" distB="0" distL="0" distR="0" wp14:anchorId="4A820821" wp14:editId="3B509498">
+            <wp:extent cx="5943600" cy="3012440"/>
             <wp:effectExtent l="0" t="0" r="0" b="0"/>
-            <wp:docPr id="1805829931" name="Picture 1"/>
-            <wp:cNvGraphicFramePr>
-              <a:graphicFrameLocks xmlns:a="http://schemas.openxmlformats.org/drawingml/2006/main" noChangeAspect="1"/>
-            </wp:cNvGraphicFramePr>
-            <a:graphic xmlns:a="http://schemas.openxmlformats.org/drawingml/2006/main">
-              <a:graphicData uri="http://schemas.openxmlformats.org/drawingml/2006/picture">
-                <pic:pic xmlns:pic="http://schemas.openxmlformats.org/drawingml/2006/picture">
-                  <pic:nvPicPr>
-                    <pic:cNvPr id="1805829931" name=""/>
+            <wp:docPr id="84478067" name="Picture 1"/>
+            <wp:cNvGraphicFramePr>
+              <a:graphicFrameLocks xmlns:a="http://schemas.openxmlformats.org/drawingml/2006/main" noChangeAspect="1"/>
+            </wp:cNvGraphicFramePr>
+            <a:graphic xmlns:a="http://schemas.openxmlformats.org/drawingml/2006/main">
+              <a:graphicData uri="http://schemas.openxmlformats.org/drawingml/2006/picture">
+                <pic:pic xmlns:pic="http://schemas.openxmlformats.org/drawingml/2006/picture">
+                  <pic:nvPicPr>
+                    <pic:cNvPr id="84478067" name=""/>
                     <pic:cNvPicPr/>
                   </pic:nvPicPr>
                   <pic:blipFill>
@@ -188,7 +151,7 @@
                   <pic:spPr>
                     <a:xfrm>
                       <a:off x="0" y="0"/>
-                      <a:ext cx="5943600" cy="3013075"/>
+                      <a:ext cx="5943600" cy="3012440"/>
                     </a:xfrm>
                     <a:prstGeom prst="rect">
                       <a:avLst/>
@@ -330,13 +293,8 @@
       </w:r>
     </w:p>
     <w:p>
-      <w:proofErr w:type="gramStart"/>
-      <w:r>
-        <w:t>Remote-state</w:t>
-      </w:r>
-      <w:proofErr w:type="gramEnd"/>
-      <w:r>
-        <w:t xml:space="preserve"> s3</w:t>
+      <w:r>
+        <w:t>Remote-state s3</w:t>
       </w:r>
       <w:r>
         <w:t>: Use remote backend state file for team collaboration to maintain the state of your cloud infrastructure</w:t>
@@ -353,23 +311,7 @@
     </w:p>
     <w:p>
       <w:r>
-        <w:t xml:space="preserve">State </w:t>
-      </w:r>
-      <w:proofErr w:type="gramStart"/>
-      <w:r>
-        <w:t>file is</w:t>
-      </w:r>
-      <w:proofErr w:type="gramEnd"/>
-      <w:r>
-        <w:t xml:space="preserve"> also used by EKS </w:t>
-      </w:r>
-      <w:proofErr w:type="gramStart"/>
-      <w:r>
-        <w:t>cluster</w:t>
-      </w:r>
-      <w:proofErr w:type="gramEnd"/>
-      <w:r>
-        <w:t xml:space="preserve"> to get the VPC ID of where to create private worker nodes in.</w:t>
+        <w:t>State file is also used by EKS cluster to get the VPC ID of where to create private worker nodes in.</w:t>
       </w:r>
     </w:p>
     <w:p>
@@ -510,15 +452,7 @@
     <w:p>
       <w:r>
         <w:lastRenderedPageBreak/>
-        <w:t>"</w:t>
-      </w:r>
-      <w:proofErr w:type="gramStart"/>
-      <w:r>
-        <w:t>feat</w:t>
-      </w:r>
-      <w:proofErr w:type="gramEnd"/>
-      <w:r>
-        <w:t>(terraform): provision production networking foundation"</w:t>
+        <w:t>"feat(terraform): provision production networking foundation"</w:t>
       </w:r>
       <w:r>
         <w:br/>
@@ -732,14 +666,12 @@
           <w:noProof/>
         </w:rPr>
       </w:pPr>
-      <w:proofErr w:type="spellStart"/>
       <w:r>
         <w:rPr>
           <w:highlight w:val="yellow"/>
         </w:rPr>
         <w:t>igw</w:t>
       </w:r>
-      <w:proofErr w:type="spellEnd"/>
       <w:r>
         <w:rPr>
           <w:noProof/>
@@ -1038,25 +970,7 @@
           <w:bCs/>
           <w:color w:val="EE0000"/>
         </w:rPr>
-        <w:t xml:space="preserve">feat(terraform): complete AWS platform bootstrap and </w:t>
-      </w:r>
-      <w:proofErr w:type="spellStart"/>
-      <w:r>
-        <w:rPr>
-          <w:b/>
-          <w:bCs/>
-          <w:color w:val="EE0000"/>
-        </w:rPr>
-        <w:t>dataplane</w:t>
-      </w:r>
-      <w:proofErr w:type="spellEnd"/>
-      <w:r>
-        <w:rPr>
-          <w:b/>
-          <w:bCs/>
-          <w:color w:val="EE0000"/>
-        </w:rPr>
-        <w:t xml:space="preserve"> infrastructure</w:t>
+        <w:t>feat(terraform): complete AWS platform bootstrap and dataplane infrastructure</w:t>
       </w:r>
     </w:p>
     <w:p>
@@ -1175,21 +1089,7 @@
         <w:rPr>
           <w:highlight w:val="yellow"/>
         </w:rPr>
-        <w:t xml:space="preserve">installed and running as a </w:t>
-      </w:r>
-      <w:proofErr w:type="spellStart"/>
-      <w:r>
-        <w:rPr>
-          <w:highlight w:val="yellow"/>
-        </w:rPr>
-        <w:t>daemonset</w:t>
-      </w:r>
-      <w:proofErr w:type="spellEnd"/>
-      <w:r>
-        <w:rPr>
-          <w:highlight w:val="yellow"/>
-        </w:rPr>
-        <w:t xml:space="preserve"> on each node in the cluster</w:t>
+        <w:t>installed and running as a daemonset on each node in the cluster</w:t>
       </w:r>
       <w:r>
         <w:rPr>
@@ -1258,33 +1158,11 @@
         </w:rPr>
         <w:t xml:space="preserve">for </w:t>
       </w:r>
-      <w:proofErr w:type="spellStart"/>
-      <w:r>
-        <w:rPr>
-          <w:highlight w:val="yellow"/>
-        </w:rPr>
-        <w:t>ebs</w:t>
-      </w:r>
-      <w:proofErr w:type="spellEnd"/>
-      <w:r>
-        <w:rPr>
-          <w:highlight w:val="yellow"/>
-        </w:rPr>
-        <w:t>-</w:t>
-      </w:r>
-      <w:proofErr w:type="spellStart"/>
-      <w:r>
-        <w:rPr>
-          <w:highlight w:val="yellow"/>
-        </w:rPr>
-        <w:t>csi</w:t>
-      </w:r>
-      <w:proofErr w:type="spellEnd"/>
-      <w:r>
-        <w:rPr>
-          <w:highlight w:val="yellow"/>
-        </w:rPr>
-        <w:t>-driver</w:t>
+      <w:r>
+        <w:rPr>
+          <w:highlight w:val="yellow"/>
+        </w:rPr>
+        <w:t>ebs-csi-driver</w:t>
       </w:r>
     </w:p>
     <w:p>
@@ -1781,6 +1659,9 @@
     <w:p/>
     <w:p>
       <w:r>
+        <w:rPr>
+          <w:noProof/>
+        </w:rPr>
         <w:drawing>
           <wp:inline distT="0" distB="0" distL="0" distR="0" wp14:anchorId="6D62DBA6" wp14:editId="37B38ADD">
             <wp:extent cx="5943600" cy="1727200"/>
@@ -1820,6 +1701,9 @@
     </w:p>
     <w:p>
       <w:r>
+        <w:rPr>
+          <w:noProof/>
+        </w:rPr>
         <w:lastRenderedPageBreak/>
         <w:drawing>
           <wp:inline distT="0" distB="0" distL="0" distR="0" wp14:anchorId="66214814" wp14:editId="048C0C3F">
@@ -1863,21 +1747,7 @@
         <w:rPr>
           <w:highlight w:val="yellow"/>
         </w:rPr>
-        <w:t xml:space="preserve">MySQL RDS </w:t>
-      </w:r>
-      <w:proofErr w:type="spellStart"/>
-      <w:r>
-        <w:rPr>
-          <w:highlight w:val="yellow"/>
-        </w:rPr>
-        <w:t>db</w:t>
-      </w:r>
-      <w:proofErr w:type="spellEnd"/>
-      <w:r>
-        <w:rPr>
-          <w:highlight w:val="yellow"/>
-        </w:rPr>
-        <w:t xml:space="preserve"> ASM</w:t>
+        <w:t>MySQL RDS db ASM</w:t>
       </w:r>
     </w:p>
     <w:p>
@@ -1939,25 +1809,14 @@
         <w:rPr>
           <w:highlight w:val="yellow"/>
         </w:rPr>
-        <w:t xml:space="preserve"> RDS </w:t>
-      </w:r>
-      <w:proofErr w:type="spellStart"/>
-      <w:r>
-        <w:rPr>
-          <w:highlight w:val="yellow"/>
-        </w:rPr>
-        <w:t>db</w:t>
-      </w:r>
-      <w:proofErr w:type="spellEnd"/>
-      <w:r>
-        <w:rPr>
-          <w:highlight w:val="yellow"/>
-        </w:rPr>
-        <w:t xml:space="preserve"> ASM</w:t>
-      </w:r>
-    </w:p>
-    <w:p>
-      <w:r>
+        <w:t xml:space="preserve"> RDS db ASM</w:t>
+      </w:r>
+    </w:p>
+    <w:p>
+      <w:r>
+        <w:rPr>
+          <w:noProof/>
+        </w:rPr>
         <w:drawing>
           <wp:inline distT="0" distB="0" distL="0" distR="0" wp14:anchorId="5D811B9F" wp14:editId="3D0D95B4">
             <wp:extent cx="4874400" cy="3753184"/>
@@ -2000,19 +1859,14 @@
         <w:rPr>
           <w:highlight w:val="yellow"/>
         </w:rPr>
-        <w:t xml:space="preserve">MySQL and PostgreSQL RD </w:t>
-      </w:r>
-      <w:proofErr w:type="spellStart"/>
-      <w:r>
-        <w:rPr>
-          <w:highlight w:val="yellow"/>
-        </w:rPr>
-        <w:t>dbs</w:t>
-      </w:r>
-      <w:proofErr w:type="spellEnd"/>
-    </w:p>
-    <w:p>
-      <w:r>
+        <w:t>MySQL and PostgreSQL RD dbs</w:t>
+      </w:r>
+    </w:p>
+    <w:p>
+      <w:r>
+        <w:rPr>
+          <w:noProof/>
+        </w:rPr>
         <w:drawing>
           <wp:inline distT="0" distB="0" distL="0" distR="0" wp14:anchorId="61BA3273" wp14:editId="1F8DE17A">
             <wp:extent cx="5943600" cy="2150745"/>
@@ -2052,6 +1906,9 @@
     </w:p>
     <w:p>
       <w:r>
+        <w:rPr>
+          <w:noProof/>
+        </w:rPr>
         <w:lastRenderedPageBreak/>
         <w:drawing>
           <wp:inline distT="0" distB="0" distL="0" distR="0" wp14:anchorId="62605666" wp14:editId="55CACF71">
@@ -2091,23 +1948,18 @@
       </w:r>
     </w:p>
     <w:p>
-      <w:proofErr w:type="spellStart"/>
-      <w:r>
-        <w:rPr>
-          <w:highlight w:val="yellow"/>
-        </w:rPr>
-        <w:t>Dynamodb</w:t>
-      </w:r>
-      <w:proofErr w:type="spellEnd"/>
-      <w:r>
-        <w:rPr>
-          <w:highlight w:val="yellow"/>
-        </w:rPr>
-        <w:t xml:space="preserve"> table:</w:t>
-      </w:r>
-    </w:p>
-    <w:p>
-      <w:r>
+      <w:r>
+        <w:rPr>
+          <w:highlight w:val="yellow"/>
+        </w:rPr>
+        <w:t>Dynamodb table:</w:t>
+      </w:r>
+    </w:p>
+    <w:p>
+      <w:r>
+        <w:rPr>
+          <w:noProof/>
+        </w:rPr>
         <w:drawing>
           <wp:inline distT="0" distB="0" distL="0" distR="0" wp14:anchorId="187F4BD1" wp14:editId="00DC70A4">
             <wp:extent cx="5943600" cy="2620645"/>
@@ -2147,6 +1999,9 @@
     </w:p>
     <w:p>
       <w:r>
+        <w:rPr>
+          <w:noProof/>
+        </w:rPr>
         <w:drawing>
           <wp:inline distT="0" distB="0" distL="0" distR="0" wp14:anchorId="4627D323" wp14:editId="022B7488">
             <wp:extent cx="5943600" cy="1364615"/>
@@ -2211,6 +2066,9 @@
         </w:rPr>
       </w:pPr>
       <w:r>
+        <w:rPr>
+          <w:noProof/>
+        </w:rPr>
         <w:drawing>
           <wp:inline distT="0" distB="0" distL="0" distR="0" wp14:anchorId="5579486C" wp14:editId="223A61B0">
             <wp:extent cx="5943600" cy="3646805"/>
@@ -2350,6 +2208,9 @@
     </w:p>
     <w:p>
       <w:r>
+        <w:rPr>
+          <w:noProof/>
+        </w:rPr>
         <w:drawing>
           <wp:inline distT="0" distB="0" distL="0" distR="0" wp14:anchorId="4A4D6367" wp14:editId="15EB52D8">
             <wp:extent cx="5677692" cy="3991532"/>
@@ -2389,6 +2250,9 @@
     </w:p>
     <w:p>
       <w:r>
+        <w:rPr>
+          <w:noProof/>
+        </w:rPr>
         <w:drawing>
           <wp:inline distT="0" distB="0" distL="0" distR="0" wp14:anchorId="27419C95" wp14:editId="2AEE2A54">
             <wp:extent cx="5943600" cy="2460625"/>

</xml_diff>